<commit_message>
Update project documentation and screenshots
</commit_message>
<xml_diff>
--- a/documentation/Mid-Project_SmartClinic.docx
+++ b/documentation/Mid-Project_SmartClinic.docx
@@ -474,6 +474,12 @@
         </w:rPr>
         <w:t xml:space="preserve"> </w:t>
       </w:r>
+      <w:r>
+        <w:rPr>
+          <w:rFonts w:ascii="Times New Roman" w:hAnsi="Times New Roman" w:cs="Times New Roman"/>
+        </w:rPr>
+        <w:t xml:space="preserve"> </w:t>
+      </w:r>
     </w:p>
     <w:sdt>
       <w:sdtPr>
@@ -641,10 +647,9 @@
                                       <w:ilvl w:val="0"/>
                                       <w:numId w:val="6"/>
                                     </w:numPr>
-                                    <w:spacing w:line="276" w:lineRule="auto"/>
+                                    <w:ind w:left="426"/>
                                     <w:jc w:val="both"/>
                                     <w:rPr>
-                                      <w:rFonts w:asciiTheme="majorBidi" w:hAnsiTheme="majorBidi" w:cstheme="majorBidi"/>
                                       <w:caps/>
                                       <w:color w:val="auto"/>
                                     </w:rPr>
@@ -654,408 +659,7 @@
                                       <w:rFonts w:asciiTheme="majorBidi" w:hAnsiTheme="majorBidi" w:cstheme="majorBidi"/>
                                       <w:color w:val="auto"/>
                                     </w:rPr>
-                                    <w:t xml:space="preserve">You must submit two separate copies </w:t>
-                                  </w:r>
-                                  <w:r>
-                                    <w:rPr>
-                                      <w:rFonts w:asciiTheme="majorBidi" w:hAnsiTheme="majorBidi" w:cstheme="majorBidi"/>
-                                      <w:b/>
-                                      <w:bCs/>
-                                      <w:color w:val="auto"/>
-                                    </w:rPr>
-                                    <w:t>(one Word file and one PDF file)</w:t>
-                                  </w:r>
-                                  <w:r>
-                                    <w:rPr>
-                                      <w:rFonts w:asciiTheme="majorBidi" w:hAnsiTheme="majorBidi" w:cstheme="majorBidi"/>
-                                      <w:color w:val="auto"/>
-                                    </w:rPr>
                                     <w:t xml:space="preserve"> </w:t>
-                                  </w:r>
-                                  <w:r>
-                                    <w:rPr>
-                                      <w:rFonts w:asciiTheme="majorBidi" w:hAnsiTheme="majorBidi" w:cstheme="majorBidi"/>
-                                      <w:color w:val="auto"/>
-                                    </w:rPr>
-                                    <w:t xml:space="preserve">using the Assignment Template </w:t>
-                                  </w:r>
-                                  <w:r>
-                                    <w:rPr>
-                                      <w:rFonts w:asciiTheme="majorBidi" w:hAnsiTheme="majorBidi" w:cstheme="majorBidi"/>
-                                      <w:color w:val="auto"/>
-                                    </w:rPr>
-                                    <w:t xml:space="preserve">on Blackboard via the allocated folder. These files </w:t>
-                                  </w:r>
-                                  <w:r>
-                                    <w:rPr>
-                                      <w:rFonts w:asciiTheme="majorBidi" w:hAnsiTheme="majorBidi" w:cstheme="majorBidi"/>
-                                      <w:b/>
-                                      <w:bCs/>
-                                      <w:color w:val="auto"/>
-                                    </w:rPr>
-                                    <w:t>must not be in compressed format</w:t>
-                                  </w:r>
-                                  <w:r>
-                                    <w:rPr>
-                                      <w:rFonts w:asciiTheme="majorBidi" w:hAnsiTheme="majorBidi" w:cstheme="majorBidi"/>
-                                      <w:color w:val="auto"/>
-                                    </w:rPr>
-                                    <w:t>.</w:t>
-                                  </w:r>
-                                </w:p>
-                                <w:p>
-                                  <w:pPr>
-                                    <w:pStyle w:val="ListParagraph"/>
-                                    <w:numPr>
-                                      <w:ilvl w:val="0"/>
-                                      <w:numId w:val="6"/>
-                                    </w:numPr>
-                                    <w:spacing w:line="276" w:lineRule="auto"/>
-                                    <w:ind w:left="426"/>
-                                    <w:jc w:val="both"/>
-                                    <w:rPr>
-                                      <w:color w:val="auto"/>
-                                    </w:rPr>
-                                  </w:pPr>
-                                  <w:r>
-                                    <w:rPr>
-                                      <w:color w:val="auto"/>
-                                    </w:rPr>
-                                    <w:t>It is your responsibility to check and make sure that you have uploaded both the correct files.</w:t>
-                                  </w:r>
-                                </w:p>
-                                <w:p>
-                                  <w:pPr>
-                                    <w:pStyle w:val="ListParagraph"/>
-                                    <w:numPr>
-                                      <w:ilvl w:val="0"/>
-                                      <w:numId w:val="6"/>
-                                    </w:numPr>
-                                    <w:spacing w:line="276" w:lineRule="auto"/>
-                                    <w:ind w:left="426"/>
-                                    <w:jc w:val="both"/>
-                                    <w:rPr>
-                                      <w:caps/>
-                                      <w:color w:val="auto"/>
-                                    </w:rPr>
-                                  </w:pPr>
-                                  <w:r>
-                                    <w:rPr>
-                                      <w:color w:val="auto"/>
-                                    </w:rPr>
-                                    <w:t>Zero ma</w:t>
-                                  </w:r>
-                                  <w:r>
-                                    <w:rPr>
-                                      <w:color w:val="auto"/>
-                                    </w:rPr>
-                                    <w:t>rk</w:t>
-                                  </w:r>
-                                  <w:r>
-                                    <w:rPr>
-                                      <w:color w:val="auto"/>
-                                    </w:rPr>
-                                    <w:t xml:space="preserve"> will be given if you try to bypass the SafeAssi</w:t>
-                                  </w:r>
-                                  <w:r>
-                                    <w:rPr>
-                                      <w:color w:val="auto"/>
-                                    </w:rPr>
-                                    <w:t>gn</w:t>
-                                  </w:r>
-                                  <w:r>
-                                    <w:rPr>
-                                      <w:color w:val="auto"/>
-                                    </w:rPr>
-                                    <w:t xml:space="preserve"> (e.g. misspell words, remove spaces between word</w:t>
-                                  </w:r>
-                                  <w:r>
-                                    <w:rPr>
-                                      <w:color w:val="auto"/>
-                                    </w:rPr>
-                                    <w:t>s</w:t>
-                                  </w:r>
-                                  <w:r>
-                                    <w:rPr>
-                                      <w:color w:val="auto"/>
-                                    </w:rPr>
-                                    <w:t>, hide characters, us</w:t>
-                                  </w:r>
-                                  <w:r>
-                                    <w:rPr>
-                                      <w:color w:val="auto"/>
-                                    </w:rPr>
-                                    <w:t>e</w:t>
-                                  </w:r>
-                                  <w:r>
-                                    <w:rPr>
-                                      <w:color w:val="auto"/>
-                                    </w:rPr>
-                                    <w:t xml:space="preserve"> different character set</w:t>
-                                  </w:r>
-                                  <w:r>
-                                    <w:rPr>
-                                      <w:color w:val="auto"/>
-                                    </w:rPr>
-                                    <w:t>s</w:t>
-                                  </w:r>
-                                  <w:r>
-                                    <w:rPr>
-                                      <w:color w:val="auto"/>
-                                    </w:rPr>
-                                    <w:t xml:space="preserve">, </w:t>
-                                  </w:r>
-                                  <w:r>
-                                    <w:rPr>
-                                      <w:color w:val="FF0000"/>
-                                    </w:rPr>
-                                    <w:t>convert text into image</w:t>
-                                  </w:r>
-                                  <w:r>
-                                    <w:rPr>
-                                      <w:color w:val="FF0000"/>
-                                    </w:rPr>
-                                    <w:t xml:space="preserve"> </w:t>
-                                  </w:r>
-                                  <w:r>
-                                    <w:rPr>
-                                      <w:color w:val="auto"/>
-                                    </w:rPr>
-                                    <w:t>or language</w:t>
-                                  </w:r>
-                                  <w:r>
-                                    <w:rPr>
-                                      <w:color w:val="auto"/>
-                                    </w:rPr>
-                                    <w:t>s</w:t>
-                                  </w:r>
-                                  <w:r>
-                                    <w:rPr>
-                                      <w:color w:val="auto"/>
-                                    </w:rPr>
-                                    <w:t xml:space="preserve"> other than English or any kind of manipulation).</w:t>
-                                  </w:r>
-                                </w:p>
-                                <w:p>
-                                  <w:pPr>
-                                    <w:pStyle w:val="ListParagraph"/>
-                                    <w:numPr>
-                                      <w:ilvl w:val="0"/>
-                                      <w:numId w:val="6"/>
-                                    </w:numPr>
-                                    <w:spacing w:line="276" w:lineRule="auto"/>
-                                    <w:ind w:left="426"/>
-                                    <w:jc w:val="both"/>
-                                    <w:rPr>
-                                      <w:caps/>
-                                      <w:color w:val="auto"/>
-                                    </w:rPr>
-                                  </w:pPr>
-                                  <w:r>
-                                    <w:rPr>
-                                      <w:color w:val="auto"/>
-                                    </w:rPr>
-                                    <w:t>Email submission will not be accepted.</w:t>
-                                  </w:r>
-                                </w:p>
-                                <w:p>
-                                  <w:pPr>
-                                    <w:pStyle w:val="ListParagraph"/>
-                                    <w:numPr>
-                                      <w:ilvl w:val="0"/>
-                                      <w:numId w:val="6"/>
-                                    </w:numPr>
-                                    <w:spacing w:line="276" w:lineRule="auto"/>
-                                    <w:ind w:left="426"/>
-                                    <w:jc w:val="both"/>
-                                    <w:rPr>
-                                      <w:caps/>
-                                      <w:color w:val="auto"/>
-                                    </w:rPr>
-                                  </w:pPr>
-                                  <w:r>
-                                    <w:rPr>
-                                      <w:color w:val="auto"/>
-                                    </w:rPr>
-                                    <w:t>You are advised to make your work clear and well-presented.</w:t>
-                                  </w:r>
-                                  <w:r>
-                                    <w:rPr>
-                                      <w:color w:val="auto"/>
-                                    </w:rPr>
-                                    <w:t xml:space="preserve"> This includes filling your information on the cover page.</w:t>
-                                  </w:r>
-                                </w:p>
-                                <w:p>
-                                  <w:pPr>
-                                    <w:pStyle w:val="ListParagraph"/>
-                                    <w:numPr>
-                                      <w:ilvl w:val="0"/>
-                                      <w:numId w:val="6"/>
-                                    </w:numPr>
-                                    <w:spacing w:line="276" w:lineRule="auto"/>
-                                    <w:ind w:left="426"/>
-                                    <w:jc w:val="both"/>
-                                    <w:rPr>
-                                      <w:caps/>
-                                      <w:color w:val="auto"/>
-                                    </w:rPr>
-                                  </w:pPr>
-                                  <w:r>
-                                    <w:rPr>
-                                      <w:color w:val="auto"/>
-                                    </w:rPr>
-                                    <w:t>You must use this template, failing which will result in zero mark.</w:t>
-                                  </w:r>
-                                </w:p>
-                                <w:p>
-                                  <w:pPr>
-                                    <w:pStyle w:val="ListParagraph"/>
-                                    <w:numPr>
-                                      <w:ilvl w:val="0"/>
-                                      <w:numId w:val="6"/>
-                                    </w:numPr>
-                                    <w:spacing w:line="276" w:lineRule="auto"/>
-                                    <w:ind w:left="426"/>
-                                    <w:jc w:val="both"/>
-                                    <w:rPr>
-                                      <w:caps/>
-                                      <w:color w:val="auto"/>
-                                    </w:rPr>
-                                  </w:pPr>
-                                  <w:r>
-                                    <w:rPr>
-                                      <w:color w:val="auto"/>
-                                    </w:rPr>
-                                    <w:t>You MUST show all your work</w:t>
-                                  </w:r>
-                                  <w:r>
-                                    <w:rPr>
-                                      <w:color w:val="auto"/>
-                                    </w:rPr>
-                                    <w:t xml:space="preserve">, and text </w:t>
-                                  </w:r>
-                                  <w:r>
-                                    <w:rPr>
-                                      <w:color w:val="auto"/>
-                                      <w:u w:val="single"/>
-                                    </w:rPr>
-                                    <w:t>must not</w:t>
-                                  </w:r>
-                                  <w:r>
-                                    <w:rPr>
-                                      <w:color w:val="auto"/>
-                                    </w:rPr>
-                                    <w:t xml:space="preserve"> be converted into an image, unless specified otherwise by the question</w:t>
-                                  </w:r>
-                                  <w:r>
-                                    <w:rPr>
-                                      <w:color w:val="auto"/>
-                                    </w:rPr>
-                                    <w:t>.</w:t>
-                                  </w:r>
-                                </w:p>
-                                <w:p>
-                                  <w:pPr>
-                                    <w:pStyle w:val="ListParagraph"/>
-                                    <w:numPr>
-                                      <w:ilvl w:val="0"/>
-                                      <w:numId w:val="6"/>
-                                    </w:numPr>
-                                    <w:spacing w:line="276" w:lineRule="auto"/>
-                                    <w:ind w:left="426"/>
-                                    <w:jc w:val="both"/>
-                                    <w:rPr>
-                                      <w:caps/>
-                                      <w:color w:val="auto"/>
-                                    </w:rPr>
-                                  </w:pPr>
-                                  <w:r>
-                                    <w:rPr>
-                                      <w:color w:val="auto"/>
-                                    </w:rPr>
-                                    <w:t>Late submission will result in ZERO mark.</w:t>
-                                  </w:r>
-                                </w:p>
-                                <w:p>
-                                  <w:pPr>
-                                    <w:pStyle w:val="ListParagraph"/>
-                                    <w:numPr>
-                                      <w:ilvl w:val="0"/>
-                                      <w:numId w:val="6"/>
-                                    </w:numPr>
-                                    <w:spacing w:line="276" w:lineRule="auto"/>
-                                    <w:ind w:left="426"/>
-                                    <w:jc w:val="both"/>
-                                    <w:rPr>
-                                      <w:caps/>
-                                      <w:color w:val="auto"/>
-                                    </w:rPr>
-                                  </w:pPr>
-                                  <w:r>
-                                    <w:rPr>
-                                      <w:color w:val="auto"/>
-                                    </w:rPr>
-                                    <w:t xml:space="preserve">The work should be your own, copying from students or other </w:t>
-                                  </w:r>
-                                  <w:r>
-                                    <w:rPr>
-                                      <w:color w:val="auto"/>
-                                    </w:rPr>
-                                    <w:t>resources</w:t>
-                                  </w:r>
-                                  <w:r>
-                                    <w:rPr>
-                                      <w:color w:val="auto"/>
-                                    </w:rPr>
-                                    <w:t xml:space="preserve"> will result in ZERO mark</w:t>
-                                  </w:r>
-                                  <w:r>
-                                    <w:rPr>
-                                      <w:color w:val="auto"/>
-                                    </w:rPr>
-                                    <w:t>.</w:t>
-                                  </w:r>
-                                </w:p>
-                                <w:p>
-                                  <w:pPr>
-                                    <w:pStyle w:val="ListParagraph"/>
-                                    <w:numPr>
-                                      <w:ilvl w:val="0"/>
-                                      <w:numId w:val="6"/>
-                                    </w:numPr>
-                                    <w:ind w:left="426"/>
-                                    <w:jc w:val="both"/>
-                                    <w:rPr>
-                                      <w:caps/>
-                                      <w:color w:val="auto"/>
-                                    </w:rPr>
-                                  </w:pPr>
-                                  <w:r>
-                                    <w:rPr>
-                                      <w:color w:val="auto"/>
-                                    </w:rPr>
-                                    <w:t xml:space="preserve">Use </w:t>
-                                  </w:r>
-                                  <w:r>
-                                    <w:rPr>
-                                      <w:b/>
-                                      <w:bCs/>
-                                      <w:color w:val="auto"/>
-                                    </w:rPr>
-                                    <w:t xml:space="preserve">Times New Roman </w:t>
-                                  </w:r>
-                                  <w:r>
-                                    <w:rPr>
-                                      <w:color w:val="auto"/>
-                                    </w:rPr>
-                                    <w:t>font for all your answers</w:t>
-                                  </w:r>
-                                  <w:r>
-                                    <w:rPr>
-                                      <w:color w:val="auto"/>
-                                    </w:rPr>
-                                    <w:t xml:space="preserve">. </w:t>
                                   </w:r>
                                 </w:p>
                               </w:txbxContent>
@@ -1111,392 +715,13 @@
                         </w:txbxContent>
                       </v:textbox>
                     </v:rect>
+                    <v:shapetype id="_x0000_t202" coordsize="21600,21600" o:spt="202" path="m,l,21600r21600,l21600,xe">
+                      <v:stroke joinstyle="miter"/>
+                      <v:path gradientshapeok="t" o:connecttype="rect"/>
+                    </v:shapetype>
                     <v:shape id="Text Box 200" o:spid="_x0000_s1030" type="#_x0000_t202" style="position:absolute;top:2896;width:35784;height:19908;visibility:visible;mso-wrap-style:square;v-text-anchor:top" o:gfxdata="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" filled="f" stroked="f" strokeweight=".5pt">
                       <v:textbox inset=",7.2pt,,0">
                         <w:txbxContent>
-                          <w:p>
-                            <w:pPr>
-                              <w:pStyle w:val="ListParagraph"/>
-                              <w:numPr>
-                                <w:ilvl w:val="0"/>
-                                <w:numId w:val="6"/>
-                              </w:numPr>
-                              <w:spacing w:line="276" w:lineRule="auto"/>
-                              <w:jc w:val="both"/>
-                              <w:rPr>
-                                <w:rFonts w:asciiTheme="majorBidi" w:hAnsiTheme="majorBidi" w:cstheme="majorBidi"/>
-                                <w:caps/>
-                                <w:color w:val="auto"/>
-                              </w:rPr>
-                            </w:pPr>
-                            <w:r>
-                              <w:rPr>
-                                <w:rFonts w:asciiTheme="majorBidi" w:hAnsiTheme="majorBidi" w:cstheme="majorBidi"/>
-                                <w:color w:val="auto"/>
-                              </w:rPr>
-                              <w:t xml:space="preserve">You must submit two separate copies </w:t>
-                            </w:r>
-                            <w:r>
-                              <w:rPr>
-                                <w:rFonts w:asciiTheme="majorBidi" w:hAnsiTheme="majorBidi" w:cstheme="majorBidi"/>
-                                <w:b/>
-                                <w:bCs/>
-                                <w:color w:val="auto"/>
-                              </w:rPr>
-                              <w:t>(one Word file and one PDF file)</w:t>
-                            </w:r>
-                            <w:r>
-                              <w:rPr>
-                                <w:rFonts w:asciiTheme="majorBidi" w:hAnsiTheme="majorBidi" w:cstheme="majorBidi"/>
-                                <w:color w:val="auto"/>
-                              </w:rPr>
-                              <w:t xml:space="preserve"> </w:t>
-                            </w:r>
-                            <w:r>
-                              <w:rPr>
-                                <w:rFonts w:asciiTheme="majorBidi" w:hAnsiTheme="majorBidi" w:cstheme="majorBidi"/>
-                                <w:color w:val="auto"/>
-                              </w:rPr>
-                              <w:t xml:space="preserve">using the Assignment Template </w:t>
-                            </w:r>
-                            <w:r>
-                              <w:rPr>
-                                <w:rFonts w:asciiTheme="majorBidi" w:hAnsiTheme="majorBidi" w:cstheme="majorBidi"/>
-                                <w:color w:val="auto"/>
-                              </w:rPr>
-                              <w:t xml:space="preserve">on Blackboard via the allocated folder. These files </w:t>
-                            </w:r>
-                            <w:r>
-                              <w:rPr>
-                                <w:rFonts w:asciiTheme="majorBidi" w:hAnsiTheme="majorBidi" w:cstheme="majorBidi"/>
-                                <w:b/>
-                                <w:bCs/>
-                                <w:color w:val="auto"/>
-                              </w:rPr>
-                              <w:t>must not be in compressed format</w:t>
-                            </w:r>
-                            <w:r>
-                              <w:rPr>
-                                <w:rFonts w:asciiTheme="majorBidi" w:hAnsiTheme="majorBidi" w:cstheme="majorBidi"/>
-                                <w:color w:val="auto"/>
-                              </w:rPr>
-                              <w:t>.</w:t>
-                            </w:r>
-                          </w:p>
-                          <w:p>
-                            <w:pPr>
-                              <w:pStyle w:val="ListParagraph"/>
-                              <w:numPr>
-                                <w:ilvl w:val="0"/>
-                                <w:numId w:val="6"/>
-                              </w:numPr>
-                              <w:spacing w:line="276" w:lineRule="auto"/>
-                              <w:ind w:left="426"/>
-                              <w:jc w:val="both"/>
-                              <w:rPr>
-                                <w:color w:val="auto"/>
-                              </w:rPr>
-                            </w:pPr>
-                            <w:r>
-                              <w:rPr>
-                                <w:color w:val="auto"/>
-                              </w:rPr>
-                              <w:t>It is your responsibility to check and make sure that you have uploaded both the correct files.</w:t>
-                            </w:r>
-                          </w:p>
-                          <w:p>
-                            <w:pPr>
-                              <w:pStyle w:val="ListParagraph"/>
-                              <w:numPr>
-                                <w:ilvl w:val="0"/>
-                                <w:numId w:val="6"/>
-                              </w:numPr>
-                              <w:spacing w:line="276" w:lineRule="auto"/>
-                              <w:ind w:left="426"/>
-                              <w:jc w:val="both"/>
-                              <w:rPr>
-                                <w:caps/>
-                                <w:color w:val="auto"/>
-                              </w:rPr>
-                            </w:pPr>
-                            <w:r>
-                              <w:rPr>
-                                <w:color w:val="auto"/>
-                              </w:rPr>
-                              <w:t>Zero ma</w:t>
-                            </w:r>
-                            <w:r>
-                              <w:rPr>
-                                <w:color w:val="auto"/>
-                              </w:rPr>
-                              <w:t>rk</w:t>
-                            </w:r>
-                            <w:r>
-                              <w:rPr>
-                                <w:color w:val="auto"/>
-                              </w:rPr>
-                              <w:t xml:space="preserve"> will be given if you try to bypass the SafeAssi</w:t>
-                            </w:r>
-                            <w:r>
-                              <w:rPr>
-                                <w:color w:val="auto"/>
-                              </w:rPr>
-                              <w:t>gn</w:t>
-                            </w:r>
-                            <w:r>
-                              <w:rPr>
-                                <w:color w:val="auto"/>
-                              </w:rPr>
-                              <w:t xml:space="preserve"> (e.g. misspell words, remove spaces between word</w:t>
-                            </w:r>
-                            <w:r>
-                              <w:rPr>
-                                <w:color w:val="auto"/>
-                              </w:rPr>
-                              <w:t>s</w:t>
-                            </w:r>
-                            <w:r>
-                              <w:rPr>
-                                <w:color w:val="auto"/>
-                              </w:rPr>
-                              <w:t>, hide characters, us</w:t>
-                            </w:r>
-                            <w:r>
-                              <w:rPr>
-                                <w:color w:val="auto"/>
-                              </w:rPr>
-                              <w:t>e</w:t>
-                            </w:r>
-                            <w:r>
-                              <w:rPr>
-                                <w:color w:val="auto"/>
-                              </w:rPr>
-                              <w:t xml:space="preserve"> different character set</w:t>
-                            </w:r>
-                            <w:r>
-                              <w:rPr>
-                                <w:color w:val="auto"/>
-                              </w:rPr>
-                              <w:t>s</w:t>
-                            </w:r>
-                            <w:r>
-                              <w:rPr>
-                                <w:color w:val="auto"/>
-                              </w:rPr>
-                              <w:t xml:space="preserve">, </w:t>
-                            </w:r>
-                            <w:r>
-                              <w:rPr>
-                                <w:color w:val="FF0000"/>
-                              </w:rPr>
-                              <w:t>convert text into image</w:t>
-                            </w:r>
-                            <w:r>
-                              <w:rPr>
-                                <w:color w:val="FF0000"/>
-                              </w:rPr>
-                              <w:t xml:space="preserve"> </w:t>
-                            </w:r>
-                            <w:r>
-                              <w:rPr>
-                                <w:color w:val="auto"/>
-                              </w:rPr>
-                              <w:t>or language</w:t>
-                            </w:r>
-                            <w:r>
-                              <w:rPr>
-                                <w:color w:val="auto"/>
-                              </w:rPr>
-                              <w:t>s</w:t>
-                            </w:r>
-                            <w:r>
-                              <w:rPr>
-                                <w:color w:val="auto"/>
-                              </w:rPr>
-                              <w:t xml:space="preserve"> other than English or any kind of manipulation).</w:t>
-                            </w:r>
-                          </w:p>
-                          <w:p>
-                            <w:pPr>
-                              <w:pStyle w:val="ListParagraph"/>
-                              <w:numPr>
-                                <w:ilvl w:val="0"/>
-                                <w:numId w:val="6"/>
-                              </w:numPr>
-                              <w:spacing w:line="276" w:lineRule="auto"/>
-                              <w:ind w:left="426"/>
-                              <w:jc w:val="both"/>
-                              <w:rPr>
-                                <w:caps/>
-                                <w:color w:val="auto"/>
-                              </w:rPr>
-                            </w:pPr>
-                            <w:r>
-                              <w:rPr>
-                                <w:color w:val="auto"/>
-                              </w:rPr>
-                              <w:t>Email submission will not be accepted.</w:t>
-                            </w:r>
-                          </w:p>
-                          <w:p>
-                            <w:pPr>
-                              <w:pStyle w:val="ListParagraph"/>
-                              <w:numPr>
-                                <w:ilvl w:val="0"/>
-                                <w:numId w:val="6"/>
-                              </w:numPr>
-                              <w:spacing w:line="276" w:lineRule="auto"/>
-                              <w:ind w:left="426"/>
-                              <w:jc w:val="both"/>
-                              <w:rPr>
-                                <w:caps/>
-                                <w:color w:val="auto"/>
-                              </w:rPr>
-                            </w:pPr>
-                            <w:r>
-                              <w:rPr>
-                                <w:color w:val="auto"/>
-                              </w:rPr>
-                              <w:t>You are advised to make your work clear and well-presented.</w:t>
-                            </w:r>
-                            <w:r>
-                              <w:rPr>
-                                <w:color w:val="auto"/>
-                              </w:rPr>
-                              <w:t xml:space="preserve"> This includes filling your information on the cover page.</w:t>
-                            </w:r>
-                          </w:p>
-                          <w:p>
-                            <w:pPr>
-                              <w:pStyle w:val="ListParagraph"/>
-                              <w:numPr>
-                                <w:ilvl w:val="0"/>
-                                <w:numId w:val="6"/>
-                              </w:numPr>
-                              <w:spacing w:line="276" w:lineRule="auto"/>
-                              <w:ind w:left="426"/>
-                              <w:jc w:val="both"/>
-                              <w:rPr>
-                                <w:caps/>
-                                <w:color w:val="auto"/>
-                              </w:rPr>
-                            </w:pPr>
-                            <w:r>
-                              <w:rPr>
-                                <w:color w:val="auto"/>
-                              </w:rPr>
-                              <w:t>You must use this template, failing which will result in zero mark.</w:t>
-                            </w:r>
-                          </w:p>
-                          <w:p>
-                            <w:pPr>
-                              <w:pStyle w:val="ListParagraph"/>
-                              <w:numPr>
-                                <w:ilvl w:val="0"/>
-                                <w:numId w:val="6"/>
-                              </w:numPr>
-                              <w:spacing w:line="276" w:lineRule="auto"/>
-                              <w:ind w:left="426"/>
-                              <w:jc w:val="both"/>
-                              <w:rPr>
-                                <w:caps/>
-                                <w:color w:val="auto"/>
-                              </w:rPr>
-                            </w:pPr>
-                            <w:r>
-                              <w:rPr>
-                                <w:color w:val="auto"/>
-                              </w:rPr>
-                              <w:t>You MUST show all your work</w:t>
-                            </w:r>
-                            <w:r>
-                              <w:rPr>
-                                <w:color w:val="auto"/>
-                              </w:rPr>
-                              <w:t xml:space="preserve">, and text </w:t>
-                            </w:r>
-                            <w:r>
-                              <w:rPr>
-                                <w:color w:val="auto"/>
-                                <w:u w:val="single"/>
-                              </w:rPr>
-                              <w:t>must not</w:t>
-                            </w:r>
-                            <w:r>
-                              <w:rPr>
-                                <w:color w:val="auto"/>
-                              </w:rPr>
-                              <w:t xml:space="preserve"> be converted into an image, unless specified otherwise by the question</w:t>
-                            </w:r>
-                            <w:r>
-                              <w:rPr>
-                                <w:color w:val="auto"/>
-                              </w:rPr>
-                              <w:t>.</w:t>
-                            </w:r>
-                          </w:p>
-                          <w:p>
-                            <w:pPr>
-                              <w:pStyle w:val="ListParagraph"/>
-                              <w:numPr>
-                                <w:ilvl w:val="0"/>
-                                <w:numId w:val="6"/>
-                              </w:numPr>
-                              <w:spacing w:line="276" w:lineRule="auto"/>
-                              <w:ind w:left="426"/>
-                              <w:jc w:val="both"/>
-                              <w:rPr>
-                                <w:caps/>
-                                <w:color w:val="auto"/>
-                              </w:rPr>
-                            </w:pPr>
-                            <w:r>
-                              <w:rPr>
-                                <w:color w:val="auto"/>
-                              </w:rPr>
-                              <w:t>Late submission will result in ZERO mark.</w:t>
-                            </w:r>
-                          </w:p>
-                          <w:p>
-                            <w:pPr>
-                              <w:pStyle w:val="ListParagraph"/>
-                              <w:numPr>
-                                <w:ilvl w:val="0"/>
-                                <w:numId w:val="6"/>
-                              </w:numPr>
-                              <w:spacing w:line="276" w:lineRule="auto"/>
-                              <w:ind w:left="426"/>
-                              <w:jc w:val="both"/>
-                              <w:rPr>
-                                <w:caps/>
-                                <w:color w:val="auto"/>
-                              </w:rPr>
-                            </w:pPr>
-                            <w:r>
-                              <w:rPr>
-                                <w:color w:val="auto"/>
-                              </w:rPr>
-                              <w:t xml:space="preserve">The work should be your own, copying from students or other </w:t>
-                            </w:r>
-                            <w:r>
-                              <w:rPr>
-                                <w:color w:val="auto"/>
-                              </w:rPr>
-                              <w:t>resources</w:t>
-                            </w:r>
-                            <w:r>
-                              <w:rPr>
-                                <w:color w:val="auto"/>
-                              </w:rPr>
-                              <w:t xml:space="preserve"> will result in ZERO mark</w:t>
-                            </w:r>
-                            <w:r>
-                              <w:rPr>
-                                <w:color w:val="auto"/>
-                              </w:rPr>
-                              <w:t>.</w:t>
-                            </w:r>
-                          </w:p>
                           <w:p>
                             <w:pPr>
                               <w:pStyle w:val="ListParagraph"/>
@@ -1513,29 +738,10 @@
                             </w:pPr>
                             <w:r>
                               <w:rPr>
+                                <w:rFonts w:asciiTheme="majorBidi" w:hAnsiTheme="majorBidi" w:cstheme="majorBidi"/>
                                 <w:color w:val="auto"/>
                               </w:rPr>
-                              <w:t xml:space="preserve">Use </w:t>
-                            </w:r>
-                            <w:r>
-                              <w:rPr>
-                                <w:b/>
-                                <w:bCs/>
-                                <w:color w:val="auto"/>
-                              </w:rPr>
-                              <w:t xml:space="preserve">Times New Roman </w:t>
-                            </w:r>
-                            <w:r>
-                              <w:rPr>
-                                <w:color w:val="auto"/>
-                              </w:rPr>
-                              <w:t>font for all your answers</w:t>
-                            </w:r>
-                            <w:r>
-                              <w:rPr>
-                                <w:color w:val="auto"/>
-                              </w:rPr>
-                              <w:t xml:space="preserve">. </w:t>
+                              <w:t xml:space="preserve"> </w:t>
                             </w:r>
                           </w:p>
                         </w:txbxContent>
@@ -2645,1077 +1851,6 @@
       </w:r>
     </w:p>
     <w:p>
-      <w:pPr>
-        <w:numPr>
-          <w:ilvl w:val="0"/>
-          <w:numId w:val="6"/>
-        </w:numPr>
-        <w:spacing w:before="100" w:beforeAutospacing="1" w:after="0" w:line="240" w:lineRule="auto"/>
-        <w:ind w:left="360" w:hanging="357"/>
-        <w:jc w:val="both"/>
-        <w:rPr>
-          <w:rFonts w:ascii="Times New Roman" w:hAnsi="Times New Roman" w:cs="Times New Roman"/>
-          <w:b/>
-          <w:bCs/>
-          <w:color w:val="auto"/>
-          <w:sz w:val="24"/>
-          <w:szCs w:val="24"/>
-        </w:rPr>
-      </w:pPr>
-      <w:r>
-        <w:rPr>
-          <w:rFonts w:ascii="Times New Roman" w:hAnsi="Times New Roman" w:cs="Times New Roman"/>
-          <w:color w:val="auto"/>
-          <w:sz w:val="24"/>
-          <w:szCs w:val="24"/>
-        </w:rPr>
-        <w:t>You can work on this project as a group (</w:t>
-      </w:r>
-      <w:r>
-        <w:rPr>
-          <w:rFonts w:ascii="Times New Roman" w:hAnsi="Times New Roman" w:cs="Times New Roman"/>
-          <w:color w:val="auto"/>
-          <w:sz w:val="24"/>
-          <w:szCs w:val="24"/>
-        </w:rPr>
-        <w:t>minimum 3 and maximum 4 students</w:t>
-      </w:r>
-      <w:r>
-        <w:rPr>
-          <w:rFonts w:ascii="Times New Roman" w:hAnsi="Times New Roman" w:cs="Times New Roman"/>
-          <w:color w:val="auto"/>
-          <w:sz w:val="24"/>
-          <w:szCs w:val="24"/>
-        </w:rPr>
-        <w:t xml:space="preserve">). </w:t>
-      </w:r>
-      <w:r>
-        <w:rPr>
-          <w:rFonts w:ascii="Times New Roman" w:hAnsi="Times New Roman" w:cs="Times New Roman"/>
-          <w:color w:val="000000" w:themeColor="text1"/>
-          <w:sz w:val="24"/>
-          <w:szCs w:val="24"/>
-        </w:rPr>
-        <w:t xml:space="preserve"> Each group member must submit the project individually with all group member names mentioned on the cover page. </w:t>
-      </w:r>
-    </w:p>
-    <w:p>
-      <w:pPr>
-        <w:numPr>
-          <w:ilvl w:val="0"/>
-          <w:numId w:val="6"/>
-        </w:numPr>
-        <w:spacing w:before="100" w:beforeAutospacing="1" w:after="117" w:line="240" w:lineRule="auto"/>
-        <w:ind w:hanging="357"/>
-        <w:jc w:val="both"/>
-        <w:rPr>
-          <w:rFonts w:ascii="Times New Roman" w:hAnsi="Times New Roman" w:cs="Times New Roman"/>
-          <w:color w:val="auto"/>
-          <w:sz w:val="24"/>
-          <w:szCs w:val="24"/>
-        </w:rPr>
-      </w:pPr>
-      <w:r>
-        <w:rPr>
-          <w:rFonts w:ascii="Times New Roman" w:hAnsi="Times New Roman" w:cs="Times New Roman"/>
-          <w:color w:val="auto"/>
-          <w:sz w:val="24"/>
-          <w:szCs w:val="24"/>
-        </w:rPr>
-        <w:t xml:space="preserve">This project </w:t>
-      </w:r>
-      <w:r>
-        <w:rPr>
-          <w:rFonts w:ascii="Times New Roman" w:hAnsi="Times New Roman" w:cs="Times New Roman"/>
-          <w:b/>
-          <w:bCs/>
-          <w:color w:val="auto"/>
-          <w:sz w:val="24"/>
-          <w:szCs w:val="24"/>
-        </w:rPr>
-        <w:t xml:space="preserve">worth </w:t>
-      </w:r>
-      <w:r>
-        <w:rPr>
-          <w:rFonts w:ascii="Times New Roman" w:hAnsi="Times New Roman" w:cs="Times New Roman"/>
-          <w:b/>
-          <w:bCs/>
-          <w:color w:val="auto"/>
-          <w:sz w:val="24"/>
-          <w:szCs w:val="24"/>
-        </w:rPr>
-        <w:t>20</w:t>
-      </w:r>
-      <w:r>
-        <w:rPr>
-          <w:rFonts w:ascii="Times New Roman" w:hAnsi="Times New Roman" w:cs="Times New Roman"/>
-          <w:b/>
-          <w:bCs/>
-          <w:color w:val="auto"/>
-          <w:sz w:val="24"/>
-          <w:szCs w:val="24"/>
-        </w:rPr>
-        <w:t xml:space="preserve"> marks</w:t>
-      </w:r>
-      <w:r>
-        <w:rPr>
-          <w:rFonts w:ascii="Times New Roman" w:hAnsi="Times New Roman" w:cs="Times New Roman"/>
-          <w:color w:val="auto"/>
-          <w:sz w:val="24"/>
-          <w:szCs w:val="24"/>
-        </w:rPr>
-        <w:t xml:space="preserve"> and will be distributed as in the following:</w:t>
-      </w:r>
-    </w:p>
-    <w:p>
-      <w:pPr>
-        <w:pStyle w:val="ListParagraph"/>
-        <w:numPr>
-          <w:ilvl w:val="1"/>
-          <w:numId w:val="6"/>
-        </w:numPr>
-        <w:spacing w:before="100" w:beforeAutospacing="1" w:after="117" w:line="240" w:lineRule="auto"/>
-        <w:ind w:hanging="357"/>
-        <w:rPr>
-          <w:rFonts w:ascii="Times New Roman" w:hAnsi="Times New Roman" w:cs="Times New Roman"/>
-          <w:color w:val="auto"/>
-          <w:sz w:val="24"/>
-          <w:szCs w:val="24"/>
-        </w:rPr>
-      </w:pPr>
-      <w:r>
-        <w:rPr>
-          <w:rFonts w:ascii="Times New Roman" w:hAnsi="Times New Roman" w:cs="Times New Roman"/>
-          <w:color w:val="auto"/>
-          <w:sz w:val="24"/>
-          <w:szCs w:val="24"/>
-        </w:rPr>
-        <w:t>Database Design</w:t>
-      </w:r>
-      <w:r>
-        <w:rPr>
-          <w:rFonts w:ascii="Times New Roman" w:hAnsi="Times New Roman" w:cs="Times New Roman"/>
-          <w:color w:val="auto"/>
-          <w:sz w:val="24"/>
-          <w:szCs w:val="24"/>
-        </w:rPr>
-        <w:t>.</w:t>
-      </w:r>
-      <w:r>
-        <w:rPr>
-          <w:rFonts w:ascii="Times New Roman" w:hAnsi="Times New Roman" w:cs="Times New Roman"/>
-          <w:b/>
-          <w:bCs/>
-          <w:color w:val="auto"/>
-          <w:sz w:val="24"/>
-          <w:szCs w:val="24"/>
-        </w:rPr>
-        <w:t xml:space="preserve">                                                              </w:t>
-      </w:r>
-      <w:r>
-        <w:rPr>
-          <w:rFonts w:ascii="Times New Roman" w:hAnsi="Times New Roman" w:cs="Times New Roman"/>
-          <w:b/>
-          <w:bCs/>
-          <w:color w:val="FF0000"/>
-          <w:sz w:val="24"/>
-          <w:szCs w:val="24"/>
-        </w:rPr>
-        <w:t>(</w:t>
-      </w:r>
-      <w:r>
-        <w:rPr>
-          <w:rFonts w:ascii="Times New Roman" w:hAnsi="Times New Roman" w:cs="Times New Roman"/>
-          <w:b/>
-          <w:bCs/>
-          <w:color w:val="FF0000"/>
-          <w:sz w:val="24"/>
-          <w:szCs w:val="24"/>
-        </w:rPr>
-        <w:t>6</w:t>
-      </w:r>
-      <w:r>
-        <w:rPr>
-          <w:rFonts w:ascii="Times New Roman" w:hAnsi="Times New Roman" w:cs="Times New Roman"/>
-          <w:b/>
-          <w:bCs/>
-          <w:color w:val="FF0000"/>
-          <w:sz w:val="24"/>
-          <w:szCs w:val="24"/>
-        </w:rPr>
-        <w:t xml:space="preserve"> marks)</w:t>
-      </w:r>
-    </w:p>
-    <w:p>
-      <w:pPr>
-        <w:pStyle w:val="ListParagraph"/>
-        <w:numPr>
-          <w:ilvl w:val="1"/>
-          <w:numId w:val="6"/>
-        </w:numPr>
-        <w:spacing w:before="100" w:beforeAutospacing="1" w:after="117" w:line="240" w:lineRule="auto"/>
-        <w:ind w:hanging="357"/>
-        <w:rPr>
-          <w:rFonts w:ascii="Times New Roman" w:hAnsi="Times New Roman" w:cs="Times New Roman"/>
-          <w:color w:val="auto"/>
-          <w:sz w:val="24"/>
-          <w:szCs w:val="24"/>
-        </w:rPr>
-      </w:pPr>
-      <w:r>
-        <w:rPr>
-          <w:rFonts w:ascii="Times New Roman" w:hAnsi="Times New Roman" w:cs="Times New Roman"/>
-          <w:color w:val="auto"/>
-          <w:sz w:val="24"/>
-          <w:szCs w:val="24"/>
-        </w:rPr>
-        <w:t>Database Implementation</w:t>
-      </w:r>
-      <w:r>
-        <w:rPr>
-          <w:rFonts w:ascii="Times New Roman" w:hAnsi="Times New Roman" w:cs="Times New Roman"/>
-          <w:color w:val="auto"/>
-          <w:sz w:val="24"/>
-          <w:szCs w:val="24"/>
-        </w:rPr>
-        <w:t xml:space="preserve">.            </w:t>
-      </w:r>
-      <w:r>
-        <w:rPr>
-          <w:rFonts w:ascii="Times New Roman" w:hAnsi="Times New Roman" w:cs="Times New Roman"/>
-          <w:color w:val="auto"/>
-          <w:sz w:val="24"/>
-          <w:szCs w:val="24"/>
-        </w:rPr>
-        <w:t xml:space="preserve">                           </w:t>
-      </w:r>
-      <w:r>
-        <w:rPr>
-          <w:rFonts w:ascii="Times New Roman" w:hAnsi="Times New Roman" w:cs="Times New Roman"/>
-          <w:color w:val="auto"/>
-          <w:sz w:val="24"/>
-          <w:szCs w:val="24"/>
-        </w:rPr>
-        <w:t xml:space="preserve">         </w:t>
-      </w:r>
-      <w:r>
-        <w:rPr>
-          <w:rFonts w:ascii="Times New Roman" w:hAnsi="Times New Roman" w:cs="Times New Roman"/>
-          <w:b/>
-          <w:bCs/>
-          <w:color w:val="FF0000"/>
-          <w:sz w:val="24"/>
-          <w:szCs w:val="24"/>
-        </w:rPr>
-        <w:t>(</w:t>
-      </w:r>
-      <w:r>
-        <w:rPr>
-          <w:rFonts w:ascii="Times New Roman" w:hAnsi="Times New Roman" w:cs="Times New Roman"/>
-          <w:b/>
-          <w:bCs/>
-          <w:color w:val="FF0000"/>
-          <w:sz w:val="24"/>
-          <w:szCs w:val="24"/>
-        </w:rPr>
-        <w:t>6</w:t>
-      </w:r>
-      <w:r>
-        <w:rPr>
-          <w:rFonts w:ascii="Times New Roman" w:hAnsi="Times New Roman" w:cs="Times New Roman"/>
-          <w:b/>
-          <w:bCs/>
-          <w:color w:val="FF0000"/>
-          <w:sz w:val="24"/>
-          <w:szCs w:val="24"/>
-        </w:rPr>
-        <w:t xml:space="preserve"> marks)</w:t>
-      </w:r>
-    </w:p>
-    <w:p>
-      <w:pPr>
-        <w:pStyle w:val="ListParagraph"/>
-        <w:numPr>
-          <w:ilvl w:val="1"/>
-          <w:numId w:val="6"/>
-        </w:numPr>
-        <w:spacing w:before="100" w:beforeAutospacing="1" w:after="117" w:line="240" w:lineRule="auto"/>
-        <w:ind w:hanging="357"/>
-        <w:rPr>
-          <w:rFonts w:ascii="Times New Roman" w:hAnsi="Times New Roman" w:cs="Times New Roman"/>
-          <w:color w:val="auto"/>
-          <w:sz w:val="24"/>
-          <w:szCs w:val="24"/>
-        </w:rPr>
-      </w:pPr>
-      <w:r>
-        <w:rPr>
-          <w:rFonts w:ascii="Times New Roman" w:hAnsi="Times New Roman" w:cs="Times New Roman"/>
-          <w:color w:val="auto"/>
-          <w:sz w:val="24"/>
-          <w:szCs w:val="24"/>
-        </w:rPr>
-        <w:t>SQL Operations</w:t>
-      </w:r>
-      <w:r>
-        <w:rPr>
-          <w:rFonts w:ascii="Times New Roman" w:hAnsi="Times New Roman" w:cs="Times New Roman"/>
-          <w:color w:val="auto"/>
-          <w:sz w:val="24"/>
-          <w:szCs w:val="24"/>
-        </w:rPr>
-        <w:t xml:space="preserve">.                                                         </w:t>
-      </w:r>
-      <w:r>
-        <w:rPr>
-          <w:rFonts w:ascii="Times New Roman" w:hAnsi="Times New Roman" w:cs="Times New Roman"/>
-          <w:color w:val="auto"/>
-          <w:sz w:val="24"/>
-          <w:szCs w:val="24"/>
-        </w:rPr>
-        <w:t xml:space="preserve">   </w:t>
-      </w:r>
-      <w:r>
-        <w:rPr>
-          <w:rFonts w:ascii="Times New Roman" w:hAnsi="Times New Roman" w:cs="Times New Roman"/>
-          <w:color w:val="auto"/>
-          <w:sz w:val="24"/>
-          <w:szCs w:val="24"/>
-        </w:rPr>
-        <w:t xml:space="preserve">   </w:t>
-      </w:r>
-      <w:r>
-        <w:rPr>
-          <w:rFonts w:ascii="Times New Roman" w:hAnsi="Times New Roman" w:cs="Times New Roman"/>
-          <w:b/>
-          <w:bCs/>
-          <w:color w:val="FF0000"/>
-          <w:sz w:val="24"/>
-          <w:szCs w:val="24"/>
-        </w:rPr>
-        <w:t>(</w:t>
-      </w:r>
-      <w:r>
-        <w:rPr>
-          <w:rFonts w:ascii="Times New Roman" w:hAnsi="Times New Roman" w:cs="Times New Roman"/>
-          <w:b/>
-          <w:bCs/>
-          <w:color w:val="FF0000"/>
-          <w:sz w:val="24"/>
-          <w:szCs w:val="24"/>
-        </w:rPr>
-        <w:t>6</w:t>
-      </w:r>
-      <w:r>
-        <w:rPr>
-          <w:rFonts w:ascii="Times New Roman" w:hAnsi="Times New Roman" w:cs="Times New Roman"/>
-          <w:b/>
-          <w:bCs/>
-          <w:color w:val="FF0000"/>
-          <w:sz w:val="24"/>
-          <w:szCs w:val="24"/>
-        </w:rPr>
-        <w:t xml:space="preserve"> marks)</w:t>
-      </w:r>
-    </w:p>
-    <w:p>
-      <w:pPr>
-        <w:pStyle w:val="ListParagraph"/>
-        <w:numPr>
-          <w:ilvl w:val="1"/>
-          <w:numId w:val="6"/>
-        </w:numPr>
-        <w:spacing w:before="100" w:beforeAutospacing="1" w:after="117" w:line="240" w:lineRule="auto"/>
-        <w:ind w:hanging="357"/>
-        <w:rPr>
-          <w:rFonts w:ascii="Times New Roman" w:hAnsi="Times New Roman" w:cs="Times New Roman"/>
-          <w:color w:val="auto"/>
-          <w:sz w:val="24"/>
-          <w:szCs w:val="24"/>
-        </w:rPr>
-      </w:pPr>
-      <w:r>
-        <w:rPr>
-          <w:rFonts w:ascii="Times New Roman" w:hAnsi="Times New Roman" w:cs="Times New Roman"/>
-          <w:color w:val="auto"/>
-          <w:sz w:val="24"/>
-          <w:szCs w:val="24"/>
-        </w:rPr>
-        <w:t xml:space="preserve">Project </w:t>
-      </w:r>
-      <w:r>
-        <w:rPr>
-          <w:rFonts w:ascii="Times New Roman" w:hAnsi="Times New Roman" w:cs="Times New Roman"/>
-          <w:color w:val="auto"/>
-          <w:sz w:val="24"/>
-          <w:szCs w:val="24"/>
-        </w:rPr>
-        <w:t>Reflection</w:t>
-      </w:r>
-      <w:r>
-        <w:rPr>
-          <w:rFonts w:ascii="Times New Roman" w:hAnsi="Times New Roman" w:cs="Times New Roman"/>
-          <w:color w:val="auto"/>
-          <w:sz w:val="24"/>
-          <w:szCs w:val="24"/>
-        </w:rPr>
-        <w:t xml:space="preserve">.                    </w:t>
-      </w:r>
-      <w:r>
-        <w:rPr>
-          <w:rFonts w:ascii="Times New Roman" w:hAnsi="Times New Roman" w:cs="Times New Roman"/>
-          <w:color w:val="auto"/>
-          <w:sz w:val="24"/>
-          <w:szCs w:val="24"/>
-        </w:rPr>
-        <w:tab/>
-      </w:r>
-      <w:r>
-        <w:rPr>
-          <w:rFonts w:ascii="Times New Roman" w:hAnsi="Times New Roman" w:cs="Times New Roman"/>
-          <w:color w:val="auto"/>
-          <w:sz w:val="24"/>
-          <w:szCs w:val="24"/>
-        </w:rPr>
-        <w:tab/>
-      </w:r>
-      <w:r>
-        <w:rPr>
-          <w:rFonts w:ascii="Times New Roman" w:hAnsi="Times New Roman" w:cs="Times New Roman"/>
-          <w:color w:val="auto"/>
-          <w:sz w:val="24"/>
-          <w:szCs w:val="24"/>
-        </w:rPr>
-        <w:tab/>
-      </w:r>
-      <w:r>
-        <w:rPr>
-          <w:rFonts w:ascii="Times New Roman" w:hAnsi="Times New Roman" w:cs="Times New Roman"/>
-          <w:color w:val="auto"/>
-          <w:sz w:val="24"/>
-          <w:szCs w:val="24"/>
-        </w:rPr>
-        <w:tab/>
-        <w:t xml:space="preserve"> </w:t>
-      </w:r>
-      <w:r>
-        <w:rPr>
-          <w:rFonts w:ascii="Times New Roman" w:hAnsi="Times New Roman" w:cs="Times New Roman"/>
-          <w:b/>
-          <w:bCs/>
-          <w:color w:val="FF0000"/>
-          <w:sz w:val="24"/>
-          <w:szCs w:val="24"/>
-        </w:rPr>
-        <w:t>(</w:t>
-      </w:r>
-      <w:r>
-        <w:rPr>
-          <w:rFonts w:ascii="Times New Roman" w:hAnsi="Times New Roman" w:cs="Times New Roman"/>
-          <w:b/>
-          <w:bCs/>
-          <w:color w:val="EF4623" w:themeColor="accent1"/>
-          <w:sz w:val="24"/>
-          <w:szCs w:val="24"/>
-        </w:rPr>
-        <w:t>2</w:t>
-      </w:r>
-      <w:r>
-        <w:rPr>
-          <w:rFonts w:ascii="Times New Roman" w:hAnsi="Times New Roman" w:cs="Times New Roman"/>
-          <w:b/>
-          <w:bCs/>
-          <w:color w:val="FF0000"/>
-          <w:sz w:val="24"/>
-          <w:szCs w:val="24"/>
-        </w:rPr>
-        <w:t xml:space="preserve"> marks)</w:t>
-      </w:r>
-    </w:p>
-    <w:p>
-      <w:pPr>
-        <w:numPr>
-          <w:ilvl w:val="0"/>
-          <w:numId w:val="6"/>
-        </w:numPr>
-        <w:spacing w:before="100" w:beforeAutospacing="1" w:after="0" w:line="240" w:lineRule="auto"/>
-        <w:ind w:left="360" w:hanging="357"/>
-        <w:jc w:val="both"/>
-        <w:rPr>
-          <w:rFonts w:ascii="Times New Roman" w:hAnsi="Times New Roman" w:cs="Times New Roman"/>
-          <w:b/>
-          <w:bCs/>
-          <w:color w:val="auto"/>
-          <w:sz w:val="24"/>
-          <w:szCs w:val="24"/>
-        </w:rPr>
-      </w:pPr>
-      <w:r>
-        <w:rPr>
-          <w:rFonts w:ascii="Times New Roman" w:hAnsi="Times New Roman" w:cs="Times New Roman"/>
-          <w:sz w:val="24"/>
-          <w:szCs w:val="24"/>
-        </w:rPr>
-        <w:t xml:space="preserve">Each </w:t>
-      </w:r>
-      <w:r>
-        <w:rPr>
-          <w:rFonts w:ascii="Times New Roman" w:hAnsi="Times New Roman" w:cs="Times New Roman"/>
-          <w:sz w:val="24"/>
-          <w:szCs w:val="24"/>
-        </w:rPr>
-        <w:t xml:space="preserve">leader in the </w:t>
-      </w:r>
-      <w:r>
-        <w:rPr>
-          <w:rFonts w:ascii="Times New Roman" w:hAnsi="Times New Roman" w:cs="Times New Roman"/>
-          <w:sz w:val="24"/>
-          <w:szCs w:val="24"/>
-        </w:rPr>
-        <w:t>group</w:t>
-      </w:r>
-      <w:r>
-        <w:rPr>
-          <w:rFonts w:ascii="Times New Roman" w:hAnsi="Times New Roman" w:cs="Times New Roman"/>
-          <w:sz w:val="24"/>
-          <w:szCs w:val="24"/>
-        </w:rPr>
-        <w:t xml:space="preserve"> must submit one report about </w:t>
-      </w:r>
-      <w:r>
-        <w:rPr>
-          <w:rFonts w:ascii="Times New Roman" w:hAnsi="Times New Roman" w:cs="Times New Roman"/>
-          <w:sz w:val="24"/>
-          <w:szCs w:val="24"/>
-        </w:rPr>
-        <w:t>their</w:t>
-      </w:r>
-      <w:r>
-        <w:rPr>
-          <w:rFonts w:ascii="Times New Roman" w:hAnsi="Times New Roman" w:cs="Times New Roman"/>
-          <w:sz w:val="24"/>
-          <w:szCs w:val="24"/>
-        </w:rPr>
-        <w:t xml:space="preserve"> chosen Project via the Blackboard </w:t>
-      </w:r>
-      <w:r>
-        <w:rPr>
-          <w:rFonts w:ascii="Times New Roman" w:hAnsi="Times New Roman" w:cs="Times New Roman"/>
-          <w:color w:val="FF0000"/>
-          <w:sz w:val="24"/>
-          <w:szCs w:val="24"/>
-        </w:rPr>
-        <w:t>(</w:t>
-      </w:r>
-      <w:r>
-        <w:rPr>
-          <w:rFonts w:ascii="Times New Roman" w:hAnsi="Times New Roman" w:cs="Times New Roman"/>
-          <w:b/>
-          <w:color w:val="FF0000"/>
-          <w:sz w:val="24"/>
-          <w:szCs w:val="24"/>
-        </w:rPr>
-        <w:t xml:space="preserve">Email submission will not be accepted </w:t>
-      </w:r>
-      <w:r>
-        <w:rPr>
-          <w:rFonts w:ascii="Times New Roman" w:hAnsi="Times New Roman" w:cs="Times New Roman"/>
-          <w:b/>
-          <w:color w:val="FF0000"/>
-          <w:sz w:val="24"/>
-          <w:szCs w:val="24"/>
-        </w:rPr>
-        <w:t>and</w:t>
-      </w:r>
-      <w:r>
-        <w:rPr>
-          <w:rFonts w:ascii="Times New Roman" w:hAnsi="Times New Roman" w:cs="Times New Roman"/>
-          <w:b/>
-          <w:color w:val="FF0000"/>
-          <w:sz w:val="24"/>
-          <w:szCs w:val="24"/>
-        </w:rPr>
-        <w:t xml:space="preserve"> will be awarded ZERO marks</w:t>
-      </w:r>
-      <w:r>
-        <w:rPr>
-          <w:rFonts w:ascii="Times New Roman" w:hAnsi="Times New Roman" w:cs="Times New Roman"/>
-          <w:color w:val="FF0000"/>
-          <w:sz w:val="24"/>
-          <w:szCs w:val="24"/>
-        </w:rPr>
-        <w:t>)</w:t>
-      </w:r>
-      <w:r>
-        <w:rPr>
-          <w:rFonts w:ascii="Times New Roman" w:hAnsi="Times New Roman" w:cs="Times New Roman"/>
-          <w:sz w:val="24"/>
-          <w:szCs w:val="24"/>
-        </w:rPr>
-        <w:t xml:space="preserve"> containing </w:t>
-      </w:r>
-      <w:bookmarkStart w:id="0" w:name="_Hlk223119713"/>
-      <w:r>
-        <w:rPr>
-          <w:rFonts w:ascii="Times New Roman" w:hAnsi="Times New Roman" w:cs="Times New Roman"/>
-          <w:sz w:val="24"/>
-          <w:szCs w:val="24"/>
-        </w:rPr>
-        <w:t>the following:</w:t>
-      </w:r>
-    </w:p>
-    <w:p>
-      <w:pPr>
-        <w:pStyle w:val="ListParagraph"/>
-        <w:numPr>
-          <w:ilvl w:val="0"/>
-          <w:numId w:val="19"/>
-        </w:numPr>
-        <w:spacing w:after="0" w:line="240" w:lineRule="auto"/>
-        <w:ind w:hanging="357"/>
-        <w:jc w:val="both"/>
-        <w:rPr>
-          <w:rFonts w:ascii="Times New Roman" w:hAnsi="Times New Roman" w:cs="Times New Roman"/>
-          <w:sz w:val="24"/>
-          <w:szCs w:val="24"/>
-        </w:rPr>
-      </w:pPr>
-      <w:r>
-        <w:rPr>
-          <w:rFonts w:ascii="Times New Roman" w:hAnsi="Times New Roman" w:cs="Times New Roman"/>
-          <w:sz w:val="24"/>
-          <w:szCs w:val="24"/>
-        </w:rPr>
-        <w:t xml:space="preserve">Task </w:t>
-      </w:r>
-      <w:proofErr w:type="gramStart"/>
-      <w:r>
-        <w:rPr>
-          <w:rFonts w:ascii="Times New Roman" w:hAnsi="Times New Roman" w:cs="Times New Roman"/>
-          <w:sz w:val="24"/>
-          <w:szCs w:val="24"/>
-        </w:rPr>
-        <w:t>1 :</w:t>
-      </w:r>
-      <w:proofErr w:type="gramEnd"/>
-      <w:r>
-        <w:rPr>
-          <w:rFonts w:ascii="Times New Roman" w:hAnsi="Times New Roman" w:cs="Times New Roman"/>
-          <w:sz w:val="24"/>
-          <w:szCs w:val="24"/>
-        </w:rPr>
-        <w:t xml:space="preserve"> database design</w:t>
-      </w:r>
-    </w:p>
-    <w:p>
-      <w:pPr>
-        <w:pStyle w:val="ListParagraph"/>
-        <w:numPr>
-          <w:ilvl w:val="0"/>
-          <w:numId w:val="19"/>
-        </w:numPr>
-        <w:spacing w:before="100" w:beforeAutospacing="1" w:after="0" w:line="240" w:lineRule="auto"/>
-        <w:ind w:hanging="357"/>
-        <w:jc w:val="both"/>
-        <w:rPr>
-          <w:rFonts w:ascii="Times New Roman" w:hAnsi="Times New Roman" w:cs="Times New Roman"/>
-          <w:sz w:val="24"/>
-          <w:szCs w:val="24"/>
-        </w:rPr>
-      </w:pPr>
-      <w:r>
-        <w:rPr>
-          <w:rFonts w:ascii="Times New Roman" w:hAnsi="Times New Roman" w:cs="Times New Roman"/>
-          <w:sz w:val="24"/>
-          <w:szCs w:val="24"/>
-        </w:rPr>
-        <w:t xml:space="preserve">Task 2: database implementation </w:t>
-      </w:r>
-    </w:p>
-    <w:p>
-      <w:pPr>
-        <w:pStyle w:val="ListParagraph"/>
-        <w:numPr>
-          <w:ilvl w:val="0"/>
-          <w:numId w:val="19"/>
-        </w:numPr>
-        <w:spacing w:before="100" w:beforeAutospacing="1" w:after="0" w:line="240" w:lineRule="auto"/>
-        <w:ind w:hanging="357"/>
-        <w:jc w:val="both"/>
-        <w:rPr>
-          <w:rFonts w:ascii="Times New Roman" w:hAnsi="Times New Roman" w:cs="Times New Roman"/>
-          <w:sz w:val="24"/>
-          <w:szCs w:val="24"/>
-        </w:rPr>
-      </w:pPr>
-      <w:r>
-        <w:rPr>
-          <w:rFonts w:ascii="Times New Roman" w:hAnsi="Times New Roman" w:cs="Times New Roman"/>
-          <w:sz w:val="24"/>
-          <w:szCs w:val="24"/>
-        </w:rPr>
-        <w:t>All requested queries/results</w:t>
-      </w:r>
-    </w:p>
-    <w:p>
-      <w:pPr>
-        <w:numPr>
-          <w:ilvl w:val="0"/>
-          <w:numId w:val="19"/>
-        </w:numPr>
-        <w:spacing w:before="100" w:beforeAutospacing="1" w:after="0" w:line="240" w:lineRule="auto"/>
-        <w:ind w:hanging="357"/>
-        <w:jc w:val="both"/>
-        <w:rPr>
-          <w:rFonts w:ascii="Times New Roman" w:hAnsi="Times New Roman" w:cs="Times New Roman"/>
-          <w:caps/>
-          <w:color w:val="auto"/>
-          <w:sz w:val="24"/>
-          <w:szCs w:val="24"/>
-        </w:rPr>
-      </w:pPr>
-      <w:r>
-        <w:rPr>
-          <w:rFonts w:ascii="Times New Roman" w:hAnsi="Times New Roman" w:cs="Times New Roman"/>
-          <w:sz w:val="24"/>
-          <w:szCs w:val="24"/>
-        </w:rPr>
-        <w:t xml:space="preserve">Screenshots from MySQL (or any other software you use) of </w:t>
-      </w:r>
-      <w:r>
-        <w:rPr>
-          <w:rFonts w:ascii="Times New Roman" w:hAnsi="Times New Roman" w:cs="Times New Roman"/>
-          <w:b/>
-          <w:bCs/>
-          <w:sz w:val="24"/>
-          <w:szCs w:val="24"/>
-          <w:u w:val="single" w:color="000000"/>
-        </w:rPr>
-        <w:t>all the tables</w:t>
-      </w:r>
-      <w:r>
-        <w:rPr>
-          <w:rFonts w:ascii="Times New Roman" w:hAnsi="Times New Roman" w:cs="Times New Roman"/>
-          <w:sz w:val="24"/>
-          <w:szCs w:val="24"/>
-        </w:rPr>
-        <w:t xml:space="preserve"> after population and </w:t>
-      </w:r>
-      <w:r>
-        <w:rPr>
-          <w:rFonts w:ascii="Times New Roman" w:hAnsi="Times New Roman" w:cs="Times New Roman"/>
-          <w:b/>
-          <w:bCs/>
-          <w:sz w:val="24"/>
-          <w:szCs w:val="24"/>
-          <w:u w:val="single" w:color="000000"/>
-        </w:rPr>
-        <w:t>query results</w:t>
-      </w:r>
-      <w:r>
-        <w:rPr>
-          <w:rFonts w:ascii="Times New Roman" w:hAnsi="Times New Roman" w:cs="Times New Roman"/>
-          <w:sz w:val="24"/>
-          <w:szCs w:val="24"/>
-        </w:rPr>
-        <w:t>.</w:t>
-      </w:r>
-      <w:r>
-        <w:rPr>
-          <w:rFonts w:ascii="Times New Roman" w:hAnsi="Times New Roman" w:cs="Times New Roman"/>
-          <w:sz w:val="24"/>
-          <w:szCs w:val="24"/>
-        </w:rPr>
-        <w:t xml:space="preserve"> </w:t>
-      </w:r>
-    </w:p>
-    <w:p>
-      <w:pPr>
-        <w:pStyle w:val="ListParagraph"/>
-        <w:numPr>
-          <w:ilvl w:val="0"/>
-          <w:numId w:val="19"/>
-        </w:numPr>
-        <w:spacing w:before="100" w:beforeAutospacing="1" w:after="0" w:line="240" w:lineRule="auto"/>
-        <w:ind w:hanging="357"/>
-        <w:jc w:val="both"/>
-        <w:rPr>
-          <w:rFonts w:ascii="Times New Roman" w:hAnsi="Times New Roman" w:cs="Times New Roman"/>
-          <w:sz w:val="24"/>
-          <w:szCs w:val="24"/>
-        </w:rPr>
-      </w:pPr>
-      <w:r>
-        <w:rPr>
-          <w:rFonts w:ascii="Times New Roman" w:hAnsi="Times New Roman" w:cs="Times New Roman"/>
-          <w:sz w:val="24"/>
-          <w:szCs w:val="24"/>
-        </w:rPr>
-        <w:t>Reflection (300–500 words) describing the team's experience, challenges, design decisions, and AI usage (if applicable)</w:t>
-      </w:r>
-      <w:r>
-        <w:rPr>
-          <w:rFonts w:ascii="Times New Roman" w:hAnsi="Times New Roman" w:cs="Times New Roman"/>
-          <w:sz w:val="24"/>
-          <w:szCs w:val="24"/>
-        </w:rPr>
-        <w:t>.</w:t>
-      </w:r>
-    </w:p>
-    <w:p>
-      <w:pPr>
-        <w:numPr>
-          <w:ilvl w:val="0"/>
-          <w:numId w:val="6"/>
-        </w:numPr>
-        <w:spacing w:before="100" w:beforeAutospacing="1" w:after="0" w:line="240" w:lineRule="auto"/>
-        <w:ind w:left="360" w:hanging="357"/>
-        <w:jc w:val="both"/>
-        <w:rPr>
-          <w:rFonts w:ascii="Times New Roman" w:hAnsi="Times New Roman" w:cs="Times New Roman"/>
-          <w:sz w:val="24"/>
-          <w:szCs w:val="24"/>
-        </w:rPr>
-      </w:pPr>
-      <w:bookmarkStart w:id="1" w:name="_Hlk223121599"/>
-      <w:bookmarkEnd w:id="0"/>
-      <w:r>
-        <w:rPr>
-          <w:rFonts w:ascii="Times New Roman" w:hAnsi="Times New Roman" w:cs="Times New Roman"/>
-          <w:sz w:val="24"/>
-          <w:szCs w:val="24"/>
-        </w:rPr>
-        <w:t xml:space="preserve">Submit one </w:t>
-      </w:r>
-      <w:r>
-        <w:rPr>
-          <w:rFonts w:ascii="Times New Roman" w:hAnsi="Times New Roman" w:cs="Times New Roman"/>
-          <w:b/>
-          <w:bCs/>
-          <w:sz w:val="24"/>
-          <w:szCs w:val="24"/>
-          <w:u w:val="single"/>
-        </w:rPr>
-        <w:t>SQL file</w:t>
-      </w:r>
-      <w:r>
-        <w:rPr>
-          <w:rFonts w:ascii="Times New Roman" w:hAnsi="Times New Roman" w:cs="Times New Roman"/>
-          <w:sz w:val="24"/>
-          <w:szCs w:val="24"/>
-        </w:rPr>
-        <w:t xml:space="preserve"> containing the complete database implementation, including database creation, tables, data insertion, required queries, VIEW, and TRIGGER.</w:t>
-      </w:r>
-    </w:p>
-    <w:p>
-      <w:pPr>
-        <w:numPr>
-          <w:ilvl w:val="0"/>
-          <w:numId w:val="6"/>
-        </w:numPr>
-        <w:spacing w:before="100" w:beforeAutospacing="1" w:after="0" w:line="240" w:lineRule="auto"/>
-        <w:ind w:left="360" w:hanging="357"/>
-        <w:jc w:val="both"/>
-        <w:rPr>
-          <w:rFonts w:ascii="Times New Roman" w:hAnsi="Times New Roman" w:cs="Times New Roman"/>
-          <w:sz w:val="24"/>
-          <w:szCs w:val="24"/>
-        </w:rPr>
-      </w:pPr>
-      <w:r>
-        <w:rPr>
-          <w:rFonts w:ascii="Times New Roman" w:hAnsi="Times New Roman" w:cs="Times New Roman"/>
-          <w:sz w:val="24"/>
-          <w:szCs w:val="24"/>
-        </w:rPr>
-        <w:t xml:space="preserve">Submit a </w:t>
-      </w:r>
-      <w:r>
-        <w:rPr>
-          <w:rFonts w:ascii="Times New Roman" w:hAnsi="Times New Roman" w:cs="Times New Roman"/>
-          <w:b/>
-          <w:bCs/>
-          <w:sz w:val="24"/>
-          <w:szCs w:val="24"/>
-          <w:u w:val="single"/>
-        </w:rPr>
-        <w:t>GitHub</w:t>
-      </w:r>
-      <w:r>
-        <w:rPr>
-          <w:rFonts w:ascii="Times New Roman" w:hAnsi="Times New Roman" w:cs="Times New Roman"/>
-          <w:sz w:val="24"/>
-          <w:szCs w:val="24"/>
-        </w:rPr>
-        <w:t xml:space="preserve"> (or GitLab) repository containing the complete project with regular commits and meaningful commit messages.</w:t>
-      </w:r>
-    </w:p>
-    <w:p>
-      <w:pPr>
-        <w:numPr>
-          <w:ilvl w:val="0"/>
-          <w:numId w:val="6"/>
-        </w:numPr>
-        <w:spacing w:before="100" w:beforeAutospacing="1" w:after="0" w:line="240" w:lineRule="auto"/>
-        <w:ind w:left="360" w:hanging="357"/>
-        <w:jc w:val="both"/>
-        <w:rPr>
-          <w:rFonts w:ascii="Times New Roman" w:hAnsi="Times New Roman" w:cs="Times New Roman"/>
-          <w:sz w:val="24"/>
-          <w:szCs w:val="24"/>
-        </w:rPr>
-      </w:pPr>
-      <w:r>
-        <w:rPr>
-          <w:rFonts w:ascii="Times New Roman" w:hAnsi="Times New Roman" w:cs="Times New Roman"/>
-          <w:sz w:val="24"/>
-          <w:szCs w:val="24"/>
-        </w:rPr>
-        <w:t xml:space="preserve">Submit a </w:t>
-      </w:r>
-      <w:r>
-        <w:rPr>
-          <w:rFonts w:ascii="Times New Roman" w:hAnsi="Times New Roman" w:cs="Times New Roman"/>
-          <w:b/>
-          <w:bCs/>
-          <w:sz w:val="24"/>
-          <w:szCs w:val="24"/>
-          <w:u w:val="single"/>
-        </w:rPr>
-        <w:t>progress report</w:t>
-      </w:r>
-      <w:r>
-        <w:rPr>
-          <w:rFonts w:ascii="Times New Roman" w:hAnsi="Times New Roman" w:cs="Times New Roman"/>
-          <w:sz w:val="24"/>
-          <w:szCs w:val="24"/>
-        </w:rPr>
-        <w:t xml:space="preserve"> describing the completed work, key decisions, challenges, future plan, and contribution of each group member.</w:t>
-      </w:r>
-    </w:p>
-    <w:p>
-      <w:pPr>
-        <w:numPr>
-          <w:ilvl w:val="0"/>
-          <w:numId w:val="6"/>
-        </w:numPr>
-        <w:spacing w:before="100" w:beforeAutospacing="1" w:after="0" w:line="240" w:lineRule="auto"/>
-        <w:ind w:left="360" w:hanging="357"/>
-        <w:jc w:val="both"/>
-        <w:rPr>
-          <w:rFonts w:ascii="Times New Roman" w:hAnsi="Times New Roman" w:cs="Times New Roman"/>
-          <w:sz w:val="24"/>
-          <w:szCs w:val="24"/>
-        </w:rPr>
-      </w:pPr>
-      <w:r>
-        <w:rPr>
-          <w:rFonts w:ascii="Times New Roman" w:hAnsi="Times New Roman" w:cs="Times New Roman"/>
-          <w:sz w:val="24"/>
-          <w:szCs w:val="24"/>
-        </w:rPr>
-        <w:t xml:space="preserve">Include </w:t>
-      </w:r>
-      <w:r>
-        <w:rPr>
-          <w:rFonts w:ascii="Times New Roman" w:hAnsi="Times New Roman" w:cs="Times New Roman"/>
-          <w:b/>
-          <w:bCs/>
-          <w:sz w:val="24"/>
-          <w:szCs w:val="24"/>
-          <w:u w:val="single"/>
-        </w:rPr>
-        <w:t>links</w:t>
-      </w:r>
-      <w:r>
-        <w:rPr>
-          <w:rFonts w:ascii="Times New Roman" w:hAnsi="Times New Roman" w:cs="Times New Roman"/>
-          <w:sz w:val="24"/>
-          <w:szCs w:val="24"/>
-        </w:rPr>
-        <w:t xml:space="preserve"> to the live report document, GitHub/GitLab repository, and Google </w:t>
-      </w:r>
-      <w:proofErr w:type="spellStart"/>
-      <w:r>
-        <w:rPr>
-          <w:rFonts w:ascii="Times New Roman" w:hAnsi="Times New Roman" w:cs="Times New Roman"/>
-          <w:sz w:val="24"/>
-          <w:szCs w:val="24"/>
-        </w:rPr>
-        <w:t>Colab</w:t>
-      </w:r>
-      <w:proofErr w:type="spellEnd"/>
-      <w:r>
-        <w:rPr>
-          <w:rFonts w:ascii="Times New Roman" w:hAnsi="Times New Roman" w:cs="Times New Roman"/>
-          <w:sz w:val="24"/>
-          <w:szCs w:val="24"/>
-        </w:rPr>
-        <w:t xml:space="preserve"> notebook (if applicable) in the </w:t>
-      </w:r>
-      <w:r>
-        <w:rPr>
-          <w:rFonts w:ascii="Times New Roman" w:hAnsi="Times New Roman" w:cs="Times New Roman"/>
-          <w:b/>
-          <w:bCs/>
-          <w:sz w:val="24"/>
-          <w:szCs w:val="24"/>
-        </w:rPr>
-        <w:t>Project Artifacts</w:t>
-      </w:r>
-      <w:r>
-        <w:rPr>
-          <w:rFonts w:ascii="Times New Roman" w:hAnsi="Times New Roman" w:cs="Times New Roman"/>
-          <w:sz w:val="24"/>
-          <w:szCs w:val="24"/>
-        </w:rPr>
-        <w:t xml:space="preserve"> section of the final report.</w:t>
-      </w:r>
-    </w:p>
-    <w:bookmarkEnd w:id="1"/>
-    <w:p>
-      <w:pPr>
-        <w:numPr>
-          <w:ilvl w:val="0"/>
-          <w:numId w:val="6"/>
-        </w:numPr>
-        <w:spacing w:before="100" w:beforeAutospacing="1" w:after="0" w:line="240" w:lineRule="auto"/>
-        <w:ind w:left="360" w:hanging="357"/>
-        <w:jc w:val="both"/>
-        <w:rPr>
-          <w:rFonts w:ascii="Times New Roman" w:hAnsi="Times New Roman" w:cs="Times New Roman"/>
-          <w:caps/>
-          <w:color w:val="auto"/>
-          <w:sz w:val="24"/>
-          <w:szCs w:val="24"/>
-        </w:rPr>
-      </w:pPr>
-      <w:r>
-        <w:rPr>
-          <w:rFonts w:ascii="Times New Roman" w:hAnsi="Times New Roman" w:cs="Times New Roman"/>
-          <w:sz w:val="24"/>
-          <w:szCs w:val="24"/>
-        </w:rPr>
-        <w:t>You</w:t>
-      </w:r>
-      <w:r>
-        <w:rPr>
-          <w:rFonts w:ascii="Times New Roman" w:hAnsi="Times New Roman" w:cs="Times New Roman"/>
-          <w:color w:val="auto"/>
-          <w:sz w:val="24"/>
-          <w:szCs w:val="24"/>
-        </w:rPr>
-        <w:t xml:space="preserve"> are advised to make your work clear and </w:t>
-      </w:r>
-      <w:r>
-        <w:rPr>
-          <w:rFonts w:ascii="Times New Roman" w:hAnsi="Times New Roman" w:cs="Times New Roman"/>
-          <w:color w:val="auto"/>
-          <w:sz w:val="24"/>
-          <w:szCs w:val="24"/>
-        </w:rPr>
-        <w:t>well</w:t>
-      </w:r>
       <w:r>
         <w:rPr>
           <w:rFonts w:ascii="Times New Roman" w:hAnsi="Times New Roman" w:cs="Times New Roman"/>
@@ -3724,2594 +1859,6 @@
           <w:szCs w:val="24"/>
         </w:rPr>
         <w:t xml:space="preserve"> </w:t>
-      </w:r>
-      <w:r>
-        <w:rPr>
-          <w:rFonts w:ascii="Times New Roman" w:hAnsi="Times New Roman" w:cs="Times New Roman"/>
-          <w:color w:val="auto"/>
-          <w:sz w:val="24"/>
-          <w:szCs w:val="24"/>
-        </w:rPr>
-        <w:t>presented</w:t>
-      </w:r>
-      <w:r>
-        <w:rPr>
-          <w:rFonts w:ascii="Times New Roman" w:hAnsi="Times New Roman" w:cs="Times New Roman"/>
-          <w:color w:val="auto"/>
-          <w:sz w:val="24"/>
-          <w:szCs w:val="24"/>
-        </w:rPr>
-        <w:t xml:space="preserve">; marks may be reduced for poor presentation. This includes filling </w:t>
-      </w:r>
-      <w:r>
-        <w:rPr>
-          <w:rFonts w:ascii="Times New Roman" w:hAnsi="Times New Roman" w:cs="Times New Roman"/>
-          <w:color w:val="auto"/>
-          <w:sz w:val="24"/>
-          <w:szCs w:val="24"/>
-        </w:rPr>
-        <w:t xml:space="preserve">in </w:t>
-      </w:r>
-      <w:r>
-        <w:rPr>
-          <w:rFonts w:ascii="Times New Roman" w:hAnsi="Times New Roman" w:cs="Times New Roman"/>
-          <w:color w:val="auto"/>
-          <w:sz w:val="24"/>
-          <w:szCs w:val="24"/>
-        </w:rPr>
-        <w:t>your information on the cover page.</w:t>
-      </w:r>
-    </w:p>
-    <w:p>
-      <w:pPr>
-        <w:numPr>
-          <w:ilvl w:val="0"/>
-          <w:numId w:val="6"/>
-        </w:numPr>
-        <w:spacing w:before="100" w:beforeAutospacing="1" w:after="0" w:line="240" w:lineRule="auto"/>
-        <w:ind w:left="360" w:hanging="357"/>
-        <w:jc w:val="both"/>
-        <w:rPr>
-          <w:rFonts w:ascii="Times New Roman" w:hAnsi="Times New Roman" w:cs="Times New Roman"/>
-          <w:caps/>
-          <w:color w:val="auto"/>
-          <w:sz w:val="24"/>
-          <w:szCs w:val="24"/>
-        </w:rPr>
-      </w:pPr>
-      <w:r>
-        <w:rPr>
-          <w:rFonts w:ascii="Times New Roman" w:hAnsi="Times New Roman" w:cs="Times New Roman"/>
-          <w:color w:val="auto"/>
-          <w:sz w:val="24"/>
-          <w:szCs w:val="24"/>
-        </w:rPr>
-        <w:t xml:space="preserve">You MUST show all your work, and text </w:t>
-      </w:r>
-      <w:r>
-        <w:rPr>
-          <w:rFonts w:ascii="Times New Roman" w:hAnsi="Times New Roman" w:cs="Times New Roman"/>
-          <w:b/>
-          <w:bCs/>
-          <w:color w:val="auto"/>
-          <w:sz w:val="24"/>
-          <w:szCs w:val="24"/>
-          <w:u w:val="single"/>
-        </w:rPr>
-        <w:t>must not</w:t>
-      </w:r>
-      <w:r>
-        <w:rPr>
-          <w:rFonts w:ascii="Times New Roman" w:hAnsi="Times New Roman" w:cs="Times New Roman"/>
-          <w:color w:val="auto"/>
-          <w:sz w:val="24"/>
-          <w:szCs w:val="24"/>
-        </w:rPr>
-        <w:t xml:space="preserve"> be converted into an image unless specified otherwise by the question.</w:t>
-      </w:r>
-    </w:p>
-    <w:p>
-      <w:pPr>
-        <w:pStyle w:val="ListParagraph"/>
-        <w:numPr>
-          <w:ilvl w:val="0"/>
-          <w:numId w:val="7"/>
-        </w:numPr>
-        <w:spacing w:before="100" w:beforeAutospacing="1" w:after="0" w:line="240" w:lineRule="auto"/>
-        <w:ind w:hanging="357"/>
-        <w:jc w:val="both"/>
-        <w:rPr>
-          <w:rFonts w:ascii="Times New Roman" w:hAnsi="Times New Roman" w:cs="Times New Roman"/>
-          <w:caps/>
-          <w:color w:val="EF4623" w:themeColor="accent1"/>
-          <w:sz w:val="24"/>
-          <w:szCs w:val="24"/>
-        </w:rPr>
-      </w:pPr>
-      <w:r>
-        <w:rPr>
-          <w:rFonts w:ascii="Times New Roman" w:hAnsi="Times New Roman" w:cs="Times New Roman"/>
-          <w:b/>
-          <w:color w:val="EF4623" w:themeColor="accent1"/>
-          <w:sz w:val="24"/>
-          <w:szCs w:val="24"/>
-        </w:rPr>
-        <w:t>Late submission will result in ZERO marks being awarded</w:t>
-      </w:r>
-      <w:r>
-        <w:rPr>
-          <w:rFonts w:ascii="Times New Roman" w:hAnsi="Times New Roman" w:cs="Times New Roman"/>
-          <w:color w:val="EF4623" w:themeColor="accent1"/>
-          <w:sz w:val="24"/>
-          <w:szCs w:val="24"/>
-        </w:rPr>
-        <w:t>.</w:t>
-      </w:r>
-    </w:p>
-    <w:p>
-      <w:pPr>
-        <w:pStyle w:val="ListParagraph"/>
-        <w:numPr>
-          <w:ilvl w:val="0"/>
-          <w:numId w:val="7"/>
-        </w:numPr>
-        <w:spacing w:before="100" w:beforeAutospacing="1" w:after="0" w:line="240" w:lineRule="auto"/>
-        <w:ind w:hanging="357"/>
-        <w:jc w:val="both"/>
-        <w:rPr>
-          <w:rFonts w:ascii="Times New Roman" w:hAnsi="Times New Roman" w:cs="Times New Roman"/>
-          <w:caps/>
-          <w:color w:val="FF0000"/>
-          <w:sz w:val="24"/>
-          <w:szCs w:val="24"/>
-        </w:rPr>
-      </w:pPr>
-      <w:r>
-        <w:rPr>
-          <w:rFonts w:ascii="Times New Roman" w:hAnsi="Times New Roman" w:cs="Times New Roman"/>
-          <w:color w:val="auto"/>
-          <w:sz w:val="24"/>
-          <w:szCs w:val="24"/>
-        </w:rPr>
-        <w:t>The work should be your own</w:t>
-      </w:r>
-      <w:r>
-        <w:rPr>
-          <w:rFonts w:ascii="Times New Roman" w:hAnsi="Times New Roman" w:cs="Times New Roman"/>
-          <w:color w:val="auto"/>
-          <w:sz w:val="24"/>
-          <w:szCs w:val="24"/>
-        </w:rPr>
-        <w:t>. Copying</w:t>
-      </w:r>
-      <w:r>
-        <w:rPr>
-          <w:rFonts w:ascii="Times New Roman" w:hAnsi="Times New Roman" w:cs="Times New Roman"/>
-          <w:b/>
-          <w:color w:val="FF0000"/>
-          <w:sz w:val="24"/>
-          <w:szCs w:val="24"/>
-        </w:rPr>
-        <w:t xml:space="preserve"> from students or other resources</w:t>
-      </w:r>
-      <w:r>
-        <w:rPr>
-          <w:rFonts w:ascii="Times New Roman" w:hAnsi="Times New Roman" w:cs="Times New Roman"/>
-          <w:b/>
-          <w:color w:val="FF0000"/>
-          <w:sz w:val="24"/>
-          <w:szCs w:val="24"/>
-        </w:rPr>
-        <w:t xml:space="preserve">, including </w:t>
-      </w:r>
-      <w:r>
-        <w:rPr>
-          <w:rFonts w:ascii="Times New Roman" w:hAnsi="Times New Roman" w:cs="Times New Roman"/>
-          <w:b/>
-          <w:color w:val="0070C0"/>
-          <w:sz w:val="24"/>
-          <w:szCs w:val="24"/>
-        </w:rPr>
-        <w:t>AI software</w:t>
-      </w:r>
-      <w:r>
-        <w:rPr>
-          <w:rFonts w:ascii="Times New Roman" w:hAnsi="Times New Roman" w:cs="Times New Roman"/>
-          <w:b/>
-          <w:color w:val="FF0000"/>
-          <w:sz w:val="24"/>
-          <w:szCs w:val="24"/>
-        </w:rPr>
-        <w:t>,</w:t>
-      </w:r>
-      <w:r>
-        <w:rPr>
-          <w:rFonts w:ascii="Times New Roman" w:hAnsi="Times New Roman" w:cs="Times New Roman"/>
-          <w:b/>
-          <w:color w:val="FF0000"/>
-          <w:sz w:val="24"/>
-          <w:szCs w:val="24"/>
-        </w:rPr>
-        <w:t xml:space="preserve"> will result in </w:t>
-      </w:r>
-      <w:r>
-        <w:rPr>
-          <w:rFonts w:ascii="Times New Roman" w:hAnsi="Times New Roman" w:cs="Times New Roman"/>
-          <w:b/>
-          <w:color w:val="0070C0"/>
-          <w:sz w:val="24"/>
-          <w:szCs w:val="24"/>
-        </w:rPr>
-        <w:t>ZERO</w:t>
-      </w:r>
-      <w:r>
-        <w:rPr>
-          <w:rFonts w:ascii="Times New Roman" w:hAnsi="Times New Roman" w:cs="Times New Roman"/>
-          <w:b/>
-          <w:color w:val="FF0000"/>
-          <w:sz w:val="24"/>
-          <w:szCs w:val="24"/>
-        </w:rPr>
-        <w:t xml:space="preserve"> marks</w:t>
-      </w:r>
-      <w:r>
-        <w:rPr>
-          <w:rFonts w:ascii="Times New Roman" w:hAnsi="Times New Roman" w:cs="Times New Roman"/>
-          <w:color w:val="FF0000"/>
-          <w:sz w:val="24"/>
-          <w:szCs w:val="24"/>
-        </w:rPr>
-        <w:t>.</w:t>
-      </w:r>
-    </w:p>
-    <w:p>
-      <w:pPr>
-        <w:pStyle w:val="Heading1"/>
-        <w:rPr>
-          <w:rFonts w:ascii="Times New Roman" w:hAnsi="Times New Roman" w:cs="Times New Roman"/>
-          <w:color w:val="auto"/>
-          <w:szCs w:val="40"/>
-        </w:rPr>
-      </w:pPr>
-      <w:bookmarkStart w:id="2" w:name="_Hlk223122000"/>
-      <w:r>
-        <w:rPr>
-          <w:rFonts w:ascii="Times New Roman" w:hAnsi="Times New Roman" w:cs="Times New Roman"/>
-          <w:color w:val="auto"/>
-          <w:szCs w:val="40"/>
-        </w:rPr>
-        <w:lastRenderedPageBreak/>
-        <w:t xml:space="preserve">Project </w:t>
-      </w:r>
-      <w:r>
-        <w:rPr>
-          <w:rFonts w:ascii="Times New Roman" w:hAnsi="Times New Roman" w:cs="Times New Roman"/>
-          <w:color w:val="auto"/>
-          <w:szCs w:val="40"/>
-        </w:rPr>
-        <w:t>Description</w:t>
-      </w:r>
-      <w:bookmarkEnd w:id="2"/>
-    </w:p>
-    <w:p>
-      <w:pPr>
-        <w:ind w:hanging="180"/>
-        <w:jc w:val="both"/>
-        <w:rPr>
-          <w:rFonts w:ascii="Times New Roman" w:hAnsi="Times New Roman" w:cs="Times New Roman"/>
-          <w:b/>
-          <w:bCs/>
-          <w:sz w:val="40"/>
-          <w:szCs w:val="40"/>
-        </w:rPr>
-      </w:pPr>
-      <w:r>
-        <w:rPr>
-          <w:rFonts w:ascii="Times New Roman" w:hAnsi="Times New Roman" w:cs="Times New Roman"/>
-          <w:b/>
-          <w:bCs/>
-          <w:color w:val="auto"/>
-          <w:sz w:val="40"/>
-          <w:szCs w:val="40"/>
-        </w:rPr>
-        <w:t xml:space="preserve"> </w:t>
-      </w:r>
-      <w:r>
-        <w:rPr>
-          <w:rFonts w:ascii="Times New Roman" w:hAnsi="Times New Roman" w:cs="Times New Roman"/>
-          <w:b/>
-          <w:bCs/>
-          <w:noProof/>
-          <w:sz w:val="40"/>
-          <w:szCs w:val="40"/>
-        </w:rPr>
-        <mc:AlternateContent>
-          <mc:Choice Requires="wps">
-            <w:drawing>
-              <wp:anchor distT="0" distB="2743200" distL="182880" distR="182880" simplePos="0" relativeHeight="251681792" behindDoc="0" locked="0" layoutInCell="1" allowOverlap="1" wp14:anchorId="37A5CC29" wp14:editId="360270C2">
-                <wp:simplePos x="0" y="0"/>
-                <wp:positionH relativeFrom="page">
-                  <wp:posOffset>412750</wp:posOffset>
-                </wp:positionH>
-                <wp:positionV relativeFrom="margin">
-                  <wp:posOffset>83820</wp:posOffset>
-                </wp:positionV>
-                <wp:extent cx="1217930" cy="2304415"/>
-                <wp:effectExtent l="1270" t="1270" r="0" b="0"/>
-                <wp:wrapSquare wrapText="largest"/>
-                <wp:docPr id="1" name="Text Box 1" descr="Sidebar"/>
-                <wp:cNvGraphicFramePr>
-                  <a:graphicFrameLocks xmlns:a="http://schemas.openxmlformats.org/drawingml/2006/main"/>
-                </wp:cNvGraphicFramePr>
-                <a:graphic xmlns:a="http://schemas.openxmlformats.org/drawingml/2006/main">
-                  <a:graphicData uri="http://schemas.microsoft.com/office/word/2010/wordprocessingShape">
-                    <wps:wsp>
-                      <wps:cNvSpPr txBox="1">
-                        <a:spLocks noChangeArrowheads="1"/>
-                      </wps:cNvSpPr>
-                      <wps:spPr bwMode="auto">
-                        <a:xfrm>
-                          <a:off x="0" y="0"/>
-                          <a:ext cx="1217930" cy="2304415"/>
-                        </a:xfrm>
-                        <a:prstGeom prst="rect">
-                          <a:avLst/>
-                        </a:prstGeom>
-                        <a:noFill/>
-                        <a:ln>
-                          <a:noFill/>
-                        </a:ln>
-                        <a:extLst>
-                          <a:ext uri="{909E8E84-426E-40DD-AFC4-6F175D3DCCD1}">
-                            <a14:hiddenFill xmlns:a14="http://schemas.microsoft.com/office/drawing/2010/main">
-                              <a:solidFill>
-                                <a:srgbClr val="FFFFFF"/>
-                              </a:solidFill>
-                            </a14:hiddenFill>
-                          </a:ext>
-                          <a:ext uri="{91240B29-F687-4F45-9708-019B960494DF}">
-                            <a14:hiddenLine xmlns:a14="http://schemas.microsoft.com/office/drawing/2010/main" w="6350">
-                              <a:solidFill>
-                                <a:srgbClr val="000000"/>
-                              </a:solidFill>
-                              <a:miter lim="800000"/>
-                              <a:headEnd/>
-                              <a:tailEnd/>
-                            </a14:hiddenLine>
-                          </a:ext>
-                        </a:extLst>
-                      </wps:spPr>
-                      <wps:txbx>
-                        <w:txbxContent>
-                          <w:p>
-                            <w:pPr>
-                              <w:pStyle w:val="Quote"/>
-                              <w:rPr>
-                                <w:rStyle w:val="QuoteChar"/>
-                                <w:i/>
-                                <w:iCs/>
-                              </w:rPr>
-                            </w:pPr>
-                            <w:r>
-                              <w:rPr>
-                                <w:rStyle w:val="QuoteChar"/>
-                                <w:i/>
-                                <w:iCs/>
-                              </w:rPr>
-                              <w:t>Learning Outcome(s):</w:t>
-                            </w:r>
-                          </w:p>
-                          <w:p>
-                            <w:pPr>
-                              <w:rPr>
-                                <w:i/>
-                                <w:iCs/>
-                                <w:color w:val="FF0000"/>
-                              </w:rPr>
-                            </w:pPr>
-                          </w:p>
-                          <w:p>
-                            <w:pPr>
-                              <w:pStyle w:val="NormalWeb"/>
-                              <w:shd w:val="clear" w:color="auto" w:fill="FFFFFF"/>
-                              <w:spacing w:before="0" w:beforeAutospacing="0" w:after="0" w:afterAutospacing="0" w:line="360" w:lineRule="auto"/>
-                              <w:jc w:val="both"/>
-                              <w:rPr>
-                                <w:i/>
-                                <w:iCs/>
-                                <w:color w:val="FF0000"/>
-                                <w:sz w:val="27"/>
-                                <w:szCs w:val="27"/>
-                              </w:rPr>
-                            </w:pPr>
-                            <w:bookmarkStart w:id="3" w:name="_Hlk83660964"/>
-                            <w:r>
-                              <w:rPr>
-                                <w:rFonts w:asciiTheme="minorHAnsi" w:eastAsiaTheme="minorHAnsi" w:hAnsiTheme="minorHAnsi" w:cstheme="minorBidi"/>
-                                <w:i/>
-                                <w:iCs/>
-                                <w:color w:val="FF0000"/>
-                                <w:sz w:val="20"/>
-                                <w:szCs w:val="20"/>
-                                <w:lang w:eastAsia="ja-JP"/>
-                              </w:rPr>
-                              <w:t>CLO1, CLO2, CLO3, CLO4, CLO5</w:t>
-                            </w:r>
-                          </w:p>
-                          <w:p>
-                            <w:pPr>
-                              <w:pStyle w:val="NormalWeb"/>
-                              <w:shd w:val="clear" w:color="auto" w:fill="FFFFFF"/>
-                              <w:spacing w:before="0" w:beforeAutospacing="0" w:after="0" w:afterAutospacing="0"/>
-                              <w:rPr>
-                                <w:i/>
-                                <w:iCs/>
-                                <w:color w:val="FF0000"/>
-                                <w:sz w:val="27"/>
-                                <w:szCs w:val="27"/>
-                              </w:rPr>
-                            </w:pPr>
-                          </w:p>
-                          <w:p>
-                            <w:pPr>
-                              <w:rPr>
-                                <w:color w:val="auto"/>
-                                <w:sz w:val="24"/>
-                                <w:szCs w:val="24"/>
-                              </w:rPr>
-                            </w:pPr>
-                          </w:p>
-                          <w:bookmarkEnd w:id="3"/>
-                          <w:p/>
-                          <w:p/>
-                          <w:p/>
-                          <w:p/>
-                          <w:p>
-                            <w:pPr>
-                              <w:jc w:val="center"/>
-                              <w:rPr>
-                                <w:b/>
-                                <w:bCs/>
-                              </w:rPr>
-                            </w:pPr>
-                          </w:p>
-                          <w:p>
-                            <w:pPr>
-                              <w:jc w:val="center"/>
-                              <w:rPr>
-                                <w:b/>
-                                <w:bCs/>
-                              </w:rPr>
-                            </w:pPr>
-                          </w:p>
-                        </w:txbxContent>
-                      </wps:txbx>
-                      <wps:bodyPr rot="0" vert="horz" wrap="square" lIns="45720" tIns="0" rIns="45720" bIns="0" anchor="t" anchorCtr="0" upright="1">
-                        <a:noAutofit/>
-                      </wps:bodyPr>
-                    </wps:wsp>
-                  </a:graphicData>
-                </a:graphic>
-                <wp14:sizeRelH relativeFrom="margin">
-                  <wp14:pctWidth>25000</wp14:pctWidth>
-                </wp14:sizeRelH>
-                <wp14:sizeRelV relativeFrom="margin">
-                  <wp14:pctHeight>95000</wp14:pctHeight>
-                </wp14:sizeRelV>
-              </wp:anchor>
-            </w:drawing>
-          </mc:Choice>
-          <mc:Fallback>
-            <w:pict>
-              <v:shape w14:anchorId="37A5CC29" id="Text Box 1" o:spid="_x0000_s1032" type="#_x0000_t202" alt="Sidebar" style="position:absolute;left:0;text-align:left;margin-left:32.5pt;margin-top:6.6pt;width:95.9pt;height:181.45pt;z-index:251681792;visibility:visible;mso-wrap-style:square;mso-width-percent:250;mso-height-percent:950;mso-wrap-distance-left:14.4pt;mso-wrap-distance-top:0;mso-wrap-distance-right:14.4pt;mso-wrap-distance-bottom:3in;mso-position-horizontal:absolute;mso-position-horizontal-relative:page;mso-position-vertical:absolute;mso-position-vertical-relative:margin;mso-width-percent:250;mso-height-percent:950;mso-width-relative:margin;mso-height-relative:margin;v-text-anchor:top" o:gfxdata="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" filled="f" stroked="f" strokeweight=".5pt">
-                <v:textbox inset="3.6pt,0,3.6pt,0">
-                  <w:txbxContent>
-                    <w:p>
-                      <w:pPr>
-                        <w:pStyle w:val="Quote"/>
-                        <w:rPr>
-                          <w:rStyle w:val="QuoteChar"/>
-                          <w:i/>
-                          <w:iCs/>
-                        </w:rPr>
-                      </w:pPr>
-                      <w:r>
-                        <w:rPr>
-                          <w:rStyle w:val="QuoteChar"/>
-                          <w:i/>
-                          <w:iCs/>
-                        </w:rPr>
-                        <w:t>Learning Outcome(s):</w:t>
-                      </w:r>
-                    </w:p>
-                    <w:p>
-                      <w:pPr>
-                        <w:rPr>
-                          <w:i/>
-                          <w:iCs/>
-                          <w:color w:val="FF0000"/>
-                        </w:rPr>
-                      </w:pPr>
-                    </w:p>
-                    <w:p>
-                      <w:pPr>
-                        <w:pStyle w:val="NormalWeb"/>
-                        <w:shd w:val="clear" w:color="auto" w:fill="FFFFFF"/>
-                        <w:spacing w:before="0" w:beforeAutospacing="0" w:after="0" w:afterAutospacing="0" w:line="360" w:lineRule="auto"/>
-                        <w:jc w:val="both"/>
-                        <w:rPr>
-                          <w:i/>
-                          <w:iCs/>
-                          <w:color w:val="FF0000"/>
-                          <w:sz w:val="27"/>
-                          <w:szCs w:val="27"/>
-                        </w:rPr>
-                      </w:pPr>
-                      <w:bookmarkStart w:id="4" w:name="_Hlk83660964"/>
-                      <w:r>
-                        <w:rPr>
-                          <w:rFonts w:asciiTheme="minorHAnsi" w:eastAsiaTheme="minorHAnsi" w:hAnsiTheme="minorHAnsi" w:cstheme="minorBidi"/>
-                          <w:i/>
-                          <w:iCs/>
-                          <w:color w:val="FF0000"/>
-                          <w:sz w:val="20"/>
-                          <w:szCs w:val="20"/>
-                          <w:lang w:eastAsia="ja-JP"/>
-                        </w:rPr>
-                        <w:t>CLO1, CLO2, CLO3, CLO4, CLO5</w:t>
-                      </w:r>
-                    </w:p>
-                    <w:p>
-                      <w:pPr>
-                        <w:pStyle w:val="NormalWeb"/>
-                        <w:shd w:val="clear" w:color="auto" w:fill="FFFFFF"/>
-                        <w:spacing w:before="0" w:beforeAutospacing="0" w:after="0" w:afterAutospacing="0"/>
-                        <w:rPr>
-                          <w:i/>
-                          <w:iCs/>
-                          <w:color w:val="FF0000"/>
-                          <w:sz w:val="27"/>
-                          <w:szCs w:val="27"/>
-                        </w:rPr>
-                      </w:pPr>
-                    </w:p>
-                    <w:p>
-                      <w:pPr>
-                        <w:rPr>
-                          <w:color w:val="auto"/>
-                          <w:sz w:val="24"/>
-                          <w:szCs w:val="24"/>
-                        </w:rPr>
-                      </w:pPr>
-                    </w:p>
-                    <w:bookmarkEnd w:id="4"/>
-                    <w:p/>
-                    <w:p/>
-                    <w:p/>
-                    <w:p/>
-                    <w:p>
-                      <w:pPr>
-                        <w:jc w:val="center"/>
-                        <w:rPr>
-                          <w:b/>
-                          <w:bCs/>
-                        </w:rPr>
-                      </w:pPr>
-                    </w:p>
-                    <w:p>
-                      <w:pPr>
-                        <w:jc w:val="center"/>
-                        <w:rPr>
-                          <w:b/>
-                          <w:bCs/>
-                        </w:rPr>
-                      </w:pPr>
-                    </w:p>
-                  </w:txbxContent>
-                </v:textbox>
-                <w10:wrap type="square" side="largest" anchorx="page" anchory="margin"/>
-              </v:shape>
-            </w:pict>
-          </mc:Fallback>
-        </mc:AlternateContent>
-      </w:r>
-      <w:r>
-        <w:rPr>
-          <w:rFonts w:ascii="Times New Roman" w:hAnsi="Times New Roman" w:cs="Times New Roman"/>
-          <w:b/>
-          <w:bCs/>
-          <w:sz w:val="40"/>
-          <w:szCs w:val="40"/>
-        </w:rPr>
-        <w:t>Design and Implementation of a Smart Clinic Database System</w:t>
-      </w:r>
-    </w:p>
-    <w:p>
-      <w:pPr>
-        <w:jc w:val="both"/>
-        <w:rPr>
-          <w:rFonts w:ascii="Times New Roman" w:hAnsi="Times New Roman" w:cs="Times New Roman"/>
-          <w:sz w:val="24"/>
-          <w:szCs w:val="24"/>
-        </w:rPr>
-      </w:pPr>
-      <w:r>
-        <w:rPr>
-          <w:rFonts w:ascii="Times New Roman" w:hAnsi="Times New Roman" w:cs="Times New Roman"/>
-          <w:sz w:val="24"/>
-          <w:szCs w:val="24"/>
-        </w:rPr>
-        <w:t>A private clinic currently manages its patient information manually, making it difficult to organize appointments, treatments, and payments. The clinic has decided to develop a database system to improve data organization and retrieval.</w:t>
-      </w:r>
-    </w:p>
-    <w:p>
-      <w:pPr>
-        <w:jc w:val="both"/>
-        <w:rPr>
-          <w:rFonts w:ascii="Times New Roman" w:hAnsi="Times New Roman" w:cs="Times New Roman"/>
-          <w:sz w:val="24"/>
-          <w:szCs w:val="24"/>
-        </w:rPr>
-      </w:pPr>
-      <w:r>
-        <w:rPr>
-          <w:rFonts w:ascii="Times New Roman" w:hAnsi="Times New Roman" w:cs="Times New Roman"/>
-          <w:sz w:val="24"/>
-          <w:szCs w:val="24"/>
-        </w:rPr>
-        <w:br/>
-        <w:t>Your team is required to design, implement, and test a complete relational database using the concepts learned throughout this course. The project should demonstrate your understanding of database design, ER/EER modeling, relational mapping, SQL implementation, and advanced SQL queries. The project must be completed using MySQL.</w:t>
-      </w:r>
-    </w:p>
-    <w:p>
-      <w:pPr>
-        <w:pStyle w:val="Heading1"/>
-      </w:pPr>
-      <w:r>
-        <w:lastRenderedPageBreak/>
-        <w:t>Task 1 – Database Design (6 Marks)</w:t>
-      </w:r>
-    </w:p>
-    <w:p>
-      <w:pPr>
-        <w:pStyle w:val="ListBullet"/>
-        <w:rPr>
-          <w:rFonts w:ascii="Times New Roman" w:hAnsi="Times New Roman" w:cs="Times New Roman"/>
-          <w:sz w:val="24"/>
-          <w:szCs w:val="24"/>
-        </w:rPr>
-      </w:pPr>
-      <w:r>
-        <w:rPr>
-          <w:rFonts w:ascii="Times New Roman" w:hAnsi="Times New Roman" w:cs="Times New Roman"/>
-          <w:sz w:val="24"/>
-          <w:szCs w:val="24"/>
-        </w:rPr>
-        <w:t>Design a complete database for the clinic that includes at least six entities such as Patients, Doctors, Appointments, Treatments, Medicines, Payments, or any other appropriate entities.</w:t>
-      </w:r>
-    </w:p>
-    <w:p>
-      <w:pPr>
-        <w:pStyle w:val="ListBullet"/>
-        <w:rPr>
-          <w:rFonts w:ascii="Times New Roman" w:hAnsi="Times New Roman" w:cs="Times New Roman"/>
-          <w:sz w:val="24"/>
-          <w:szCs w:val="24"/>
-          <w:lang w:val="es-ES"/>
-        </w:rPr>
-      </w:pPr>
-      <w:r>
-        <w:rPr>
-          <w:rFonts w:ascii="Times New Roman" w:hAnsi="Times New Roman" w:cs="Times New Roman"/>
-          <w:sz w:val="24"/>
-          <w:szCs w:val="24"/>
-          <w:lang w:val="es-ES"/>
-        </w:rPr>
-        <w:t xml:space="preserve">A complete ER/EER </w:t>
-      </w:r>
-      <w:proofErr w:type="spellStart"/>
-      <w:r>
-        <w:rPr>
-          <w:rFonts w:ascii="Times New Roman" w:hAnsi="Times New Roman" w:cs="Times New Roman"/>
-          <w:sz w:val="24"/>
-          <w:szCs w:val="24"/>
-          <w:lang w:val="es-ES"/>
-        </w:rPr>
-        <w:t>diagram</w:t>
-      </w:r>
-      <w:proofErr w:type="spellEnd"/>
-      <w:r>
-        <w:rPr>
-          <w:rFonts w:ascii="Times New Roman" w:hAnsi="Times New Roman" w:cs="Times New Roman"/>
-          <w:sz w:val="24"/>
-          <w:szCs w:val="24"/>
-          <w:lang w:val="es-ES"/>
-        </w:rPr>
-        <w:t>.</w:t>
-      </w:r>
-    </w:p>
-    <w:p>
-      <w:pPr>
-        <w:pStyle w:val="ListBullet"/>
-        <w:rPr>
-          <w:rFonts w:ascii="Times New Roman" w:hAnsi="Times New Roman" w:cs="Times New Roman"/>
-          <w:sz w:val="24"/>
-          <w:szCs w:val="24"/>
-        </w:rPr>
-      </w:pPr>
-      <w:r>
-        <w:rPr>
-          <w:rFonts w:ascii="Times New Roman" w:hAnsi="Times New Roman" w:cs="Times New Roman"/>
-          <w:sz w:val="24"/>
-          <w:szCs w:val="24"/>
-        </w:rPr>
-        <w:t>Primary and foreign keys.</w:t>
-      </w:r>
-    </w:p>
-    <w:p>
-      <w:pPr>
-        <w:pStyle w:val="ListBullet"/>
-        <w:rPr>
-          <w:rFonts w:ascii="Times New Roman" w:hAnsi="Times New Roman" w:cs="Times New Roman"/>
-          <w:sz w:val="24"/>
-          <w:szCs w:val="24"/>
-        </w:rPr>
-      </w:pPr>
-      <w:r>
-        <w:rPr>
-          <w:rFonts w:ascii="Times New Roman" w:hAnsi="Times New Roman" w:cs="Times New Roman"/>
-          <w:sz w:val="24"/>
-          <w:szCs w:val="24"/>
-        </w:rPr>
-        <w:t>Appropriate relationships with cardinality.</w:t>
-      </w:r>
-    </w:p>
-    <w:p>
-      <w:pPr>
-        <w:pStyle w:val="ListBullet"/>
-        <w:rPr>
-          <w:rFonts w:ascii="Times New Roman" w:hAnsi="Times New Roman" w:cs="Times New Roman"/>
-          <w:sz w:val="24"/>
-          <w:szCs w:val="24"/>
-        </w:rPr>
-      </w:pPr>
-      <w:r>
-        <w:rPr>
-          <w:rFonts w:ascii="Times New Roman" w:hAnsi="Times New Roman" w:cs="Times New Roman"/>
-          <w:sz w:val="24"/>
-          <w:szCs w:val="24"/>
-        </w:rPr>
-        <w:t>At least one specialization/generalization (EER feature).</w:t>
-      </w:r>
-    </w:p>
-    <w:p>
-      <w:pPr>
-        <w:pStyle w:val="ListBullet"/>
-        <w:rPr>
-          <w:rFonts w:ascii="Times New Roman" w:hAnsi="Times New Roman" w:cs="Times New Roman"/>
-          <w:sz w:val="24"/>
-          <w:szCs w:val="24"/>
-        </w:rPr>
-      </w:pPr>
-      <w:r>
-        <w:rPr>
-          <w:rFonts w:ascii="Times New Roman" w:hAnsi="Times New Roman" w:cs="Times New Roman"/>
-          <w:sz w:val="24"/>
-          <w:szCs w:val="24"/>
-        </w:rPr>
-        <w:t>Any assumptions made during the design process.</w:t>
-      </w:r>
-    </w:p>
-    <w:p>
-      <w:pPr>
-        <w:pStyle w:val="Heading1"/>
-      </w:pPr>
-      <w:r>
-        <w:lastRenderedPageBreak/>
-        <w:t>Task 2 – Database Implementation (6 Marks)</w:t>
-      </w:r>
-    </w:p>
-    <w:p>
-      <w:pPr>
-        <w:pStyle w:val="ListBullet"/>
-        <w:numPr>
-          <w:ilvl w:val="0"/>
-          <w:numId w:val="0"/>
-        </w:numPr>
-        <w:rPr>
-          <w:rFonts w:ascii="Times New Roman" w:hAnsi="Times New Roman" w:cs="Times New Roman"/>
-          <w:color w:val="auto"/>
-          <w:sz w:val="24"/>
-          <w:szCs w:val="24"/>
-        </w:rPr>
-      </w:pPr>
-      <w:r>
-        <w:rPr>
-          <w:rFonts w:ascii="Times New Roman" w:hAnsi="Times New Roman" w:cs="Times New Roman"/>
-          <w:color w:val="auto"/>
-          <w:sz w:val="24"/>
-          <w:szCs w:val="24"/>
-        </w:rPr>
-        <w:t>Complete the following tasks using MySQL. Include screenshots of both your SQL code and the corresponding output (results) for each task:</w:t>
-      </w:r>
-    </w:p>
-    <w:p>
-      <w:pPr>
-        <w:pStyle w:val="ListBullet"/>
-        <w:rPr>
-          <w:rFonts w:ascii="Times New Roman" w:hAnsi="Times New Roman" w:cs="Times New Roman"/>
-          <w:color w:val="auto"/>
-          <w:sz w:val="24"/>
-          <w:szCs w:val="24"/>
-        </w:rPr>
-      </w:pPr>
-      <w:r>
-        <w:rPr>
-          <w:rFonts w:ascii="Times New Roman" w:hAnsi="Times New Roman" w:cs="Times New Roman"/>
-          <w:color w:val="auto"/>
-          <w:sz w:val="24"/>
-          <w:szCs w:val="24"/>
-        </w:rPr>
-        <w:t>Create the database and all required tables.</w:t>
-      </w:r>
-    </w:p>
-    <w:p>
-      <w:pPr>
-        <w:pStyle w:val="ListBullet"/>
-        <w:rPr>
-          <w:rFonts w:ascii="Times New Roman" w:hAnsi="Times New Roman" w:cs="Times New Roman"/>
-          <w:color w:val="auto"/>
-          <w:sz w:val="24"/>
-          <w:szCs w:val="24"/>
-        </w:rPr>
-      </w:pPr>
-      <w:r>
-        <w:rPr>
-          <w:rFonts w:ascii="Times New Roman" w:hAnsi="Times New Roman" w:cs="Times New Roman"/>
-          <w:color w:val="auto"/>
-          <w:sz w:val="24"/>
-          <w:szCs w:val="24"/>
-        </w:rPr>
-        <w:t>Use appropriate data types and constraints (PRIMARY KEY, FOREIGN KEY, NOT NULL, UNIQUE, etc.).</w:t>
-      </w:r>
-    </w:p>
-    <w:p>
-      <w:pPr>
-        <w:pStyle w:val="ListBullet"/>
-        <w:rPr>
-          <w:rFonts w:ascii="Times New Roman" w:hAnsi="Times New Roman" w:cs="Times New Roman"/>
-          <w:color w:val="auto"/>
-          <w:sz w:val="24"/>
-          <w:szCs w:val="24"/>
-        </w:rPr>
-      </w:pPr>
-      <w:r>
-        <w:rPr>
-          <w:rFonts w:ascii="Times New Roman" w:hAnsi="Times New Roman" w:cs="Times New Roman"/>
-          <w:color w:val="auto"/>
-          <w:sz w:val="24"/>
-          <w:szCs w:val="24"/>
-        </w:rPr>
-        <w:t>Insert at least 5 records into each main table.</w:t>
-      </w:r>
-    </w:p>
-    <w:p>
-      <w:pPr>
-        <w:pStyle w:val="Heading1"/>
-      </w:pPr>
-      <w:r>
-        <w:lastRenderedPageBreak/>
-        <w:t>Task 3 – SQL Operations (6 Marks)</w:t>
-      </w:r>
-    </w:p>
-    <w:p>
-      <w:pPr>
-        <w:pStyle w:val="ListBullet"/>
-        <w:numPr>
-          <w:ilvl w:val="0"/>
-          <w:numId w:val="0"/>
-        </w:numPr>
-        <w:rPr>
-          <w:rFonts w:ascii="Times New Roman" w:hAnsi="Times New Roman" w:cs="Times New Roman"/>
-          <w:color w:val="auto"/>
-          <w:sz w:val="24"/>
-          <w:szCs w:val="24"/>
-        </w:rPr>
-      </w:pPr>
-      <w:r>
-        <w:rPr>
-          <w:rFonts w:ascii="Times New Roman" w:hAnsi="Times New Roman" w:cs="Times New Roman"/>
-          <w:color w:val="auto"/>
-          <w:sz w:val="24"/>
-          <w:szCs w:val="24"/>
-        </w:rPr>
-        <w:t>Co</w:t>
-      </w:r>
-      <w:r>
-        <w:rPr>
-          <w:rFonts w:ascii="Times New Roman" w:hAnsi="Times New Roman" w:cs="Times New Roman"/>
-          <w:color w:val="auto"/>
-          <w:sz w:val="24"/>
-          <w:szCs w:val="24"/>
-        </w:rPr>
-        <w:t>mplete the following tasks using MySQL. For each task, include screenshots of both your SQL code and the corresponding output (results), along with a brief description (one to two sentences) explaining the purpose of the query and the information it is intended to retrieve.</w:t>
-      </w:r>
-    </w:p>
-    <w:p>
-      <w:pPr>
-        <w:pStyle w:val="ListBullet"/>
-        <w:rPr>
-          <w:rFonts w:ascii="Times New Roman" w:hAnsi="Times New Roman" w:cs="Times New Roman"/>
-          <w:color w:val="auto"/>
-          <w:sz w:val="24"/>
-          <w:szCs w:val="24"/>
-        </w:rPr>
-      </w:pPr>
-      <w:r>
-        <w:rPr>
-          <w:rFonts w:ascii="Times New Roman" w:hAnsi="Times New Roman" w:cs="Times New Roman"/>
-          <w:color w:val="auto"/>
-          <w:sz w:val="24"/>
-          <w:szCs w:val="24"/>
-        </w:rPr>
-        <w:t>Write SELECT statements.</w:t>
-      </w:r>
-    </w:p>
-    <w:p>
-      <w:pPr>
-        <w:pStyle w:val="ListBullet"/>
-        <w:rPr>
-          <w:rFonts w:ascii="Times New Roman" w:hAnsi="Times New Roman" w:cs="Times New Roman"/>
-          <w:color w:val="auto"/>
-          <w:sz w:val="24"/>
-          <w:szCs w:val="24"/>
-        </w:rPr>
-      </w:pPr>
-      <w:r>
-        <w:rPr>
-          <w:rFonts w:ascii="Times New Roman" w:hAnsi="Times New Roman" w:cs="Times New Roman"/>
-          <w:color w:val="auto"/>
-          <w:sz w:val="24"/>
-          <w:szCs w:val="24"/>
-        </w:rPr>
-        <w:t>Write JOIN queries.</w:t>
-      </w:r>
-    </w:p>
-    <w:p>
-      <w:pPr>
-        <w:pStyle w:val="ListBullet"/>
-        <w:rPr>
-          <w:rFonts w:ascii="Times New Roman" w:hAnsi="Times New Roman" w:cs="Times New Roman"/>
-          <w:color w:val="auto"/>
-          <w:sz w:val="24"/>
-          <w:szCs w:val="24"/>
-        </w:rPr>
-      </w:pPr>
-      <w:r>
-        <w:rPr>
-          <w:rFonts w:ascii="Times New Roman" w:hAnsi="Times New Roman" w:cs="Times New Roman"/>
-          <w:color w:val="auto"/>
-          <w:sz w:val="24"/>
-          <w:szCs w:val="24"/>
-        </w:rPr>
-        <w:t>Write nested queries.</w:t>
-      </w:r>
-    </w:p>
-    <w:p>
-      <w:pPr>
-        <w:pStyle w:val="ListBullet"/>
-        <w:rPr>
-          <w:rFonts w:ascii="Times New Roman" w:hAnsi="Times New Roman" w:cs="Times New Roman"/>
-          <w:color w:val="auto"/>
-          <w:sz w:val="24"/>
-          <w:szCs w:val="24"/>
-        </w:rPr>
-      </w:pPr>
-      <w:r>
-        <w:rPr>
-          <w:rFonts w:ascii="Times New Roman" w:hAnsi="Times New Roman" w:cs="Times New Roman"/>
-          <w:color w:val="auto"/>
-          <w:sz w:val="24"/>
-          <w:szCs w:val="24"/>
-        </w:rPr>
-        <w:t>Use aggregate functions with GROUP BY.</w:t>
-      </w:r>
-    </w:p>
-    <w:p>
-      <w:pPr>
-        <w:pStyle w:val="ListBullet"/>
-        <w:rPr>
-          <w:rFonts w:ascii="Times New Roman" w:hAnsi="Times New Roman" w:cs="Times New Roman"/>
-          <w:color w:val="auto"/>
-          <w:sz w:val="24"/>
-          <w:szCs w:val="24"/>
-        </w:rPr>
-      </w:pPr>
-      <w:r>
-        <w:rPr>
-          <w:rFonts w:ascii="Times New Roman" w:hAnsi="Times New Roman" w:cs="Times New Roman"/>
-          <w:color w:val="auto"/>
-          <w:sz w:val="24"/>
-          <w:szCs w:val="24"/>
-        </w:rPr>
-        <w:t>Write UPDATE and DELETE statements.</w:t>
-      </w:r>
-    </w:p>
-    <w:p>
-      <w:pPr>
-        <w:pStyle w:val="ListBullet"/>
-        <w:rPr>
-          <w:rFonts w:ascii="Times New Roman" w:hAnsi="Times New Roman" w:cs="Times New Roman"/>
-          <w:color w:val="auto"/>
-          <w:sz w:val="24"/>
-          <w:szCs w:val="24"/>
-        </w:rPr>
-      </w:pPr>
-      <w:r>
-        <w:rPr>
-          <w:rFonts w:ascii="Times New Roman" w:hAnsi="Times New Roman" w:cs="Times New Roman"/>
-          <w:color w:val="auto"/>
-          <w:sz w:val="24"/>
-          <w:szCs w:val="24"/>
-        </w:rPr>
-        <w:t>Create one VIEW.</w:t>
-      </w:r>
-    </w:p>
-    <w:p>
-      <w:pPr>
-        <w:pStyle w:val="ListBullet"/>
-        <w:rPr>
-          <w:rFonts w:ascii="Times New Roman" w:hAnsi="Times New Roman" w:cs="Times New Roman"/>
-          <w:color w:val="auto"/>
-          <w:sz w:val="24"/>
-          <w:szCs w:val="24"/>
-        </w:rPr>
-      </w:pPr>
-      <w:r>
-        <w:rPr>
-          <w:rFonts w:ascii="Times New Roman" w:hAnsi="Times New Roman" w:cs="Times New Roman"/>
-          <w:color w:val="auto"/>
-          <w:sz w:val="24"/>
-          <w:szCs w:val="24"/>
-        </w:rPr>
-        <w:t>Create one TRIGGER.</w:t>
-      </w:r>
-    </w:p>
-    <w:p>
-      <w:pPr>
-        <w:pStyle w:val="Heading1"/>
-      </w:pPr>
-      <w:r>
-        <w:lastRenderedPageBreak/>
-        <w:t xml:space="preserve">Task 4 – </w:t>
-      </w:r>
-      <w:r>
-        <w:t>Reflection</w:t>
-      </w:r>
-      <w:r>
-        <w:t xml:space="preserve"> (2 Marks)</w:t>
-      </w:r>
-    </w:p>
-    <w:p>
-      <w:pPr>
-        <w:pStyle w:val="ListBullet"/>
-        <w:numPr>
-          <w:ilvl w:val="0"/>
-          <w:numId w:val="0"/>
-        </w:numPr>
-        <w:ind w:left="567" w:hanging="576"/>
-        <w:jc w:val="both"/>
-        <w:rPr>
-          <w:rFonts w:ascii="Times New Roman" w:hAnsi="Times New Roman" w:cs="Times New Roman"/>
-          <w:sz w:val="24"/>
-          <w:szCs w:val="24"/>
-        </w:rPr>
-      </w:pPr>
-      <w:r>
-        <w:rPr>
-          <w:rFonts w:ascii="Times New Roman" w:hAnsi="Times New Roman" w:cs="Times New Roman"/>
-          <w:sz w:val="24"/>
-          <w:szCs w:val="24"/>
-        </w:rPr>
-        <w:t xml:space="preserve">Write a </w:t>
-      </w:r>
-      <w:r>
-        <w:rPr>
-          <w:rFonts w:ascii="Times New Roman" w:hAnsi="Times New Roman" w:cs="Times New Roman"/>
-          <w:b/>
-          <w:bCs/>
-          <w:sz w:val="24"/>
-          <w:szCs w:val="24"/>
-        </w:rPr>
-        <w:t>300–500-word reflection</w:t>
-      </w:r>
-      <w:r>
-        <w:rPr>
-          <w:rFonts w:ascii="Times New Roman" w:hAnsi="Times New Roman" w:cs="Times New Roman"/>
-          <w:sz w:val="24"/>
-          <w:szCs w:val="24"/>
-        </w:rPr>
-        <w:t xml:space="preserve"> on your experience while completing this project by</w:t>
-      </w:r>
-    </w:p>
-    <w:p>
-      <w:pPr>
-        <w:pStyle w:val="ListBullet"/>
-        <w:numPr>
-          <w:ilvl w:val="0"/>
-          <w:numId w:val="0"/>
-        </w:numPr>
-        <w:ind w:left="567" w:hanging="576"/>
-        <w:jc w:val="both"/>
-        <w:rPr>
-          <w:rFonts w:ascii="Times New Roman" w:hAnsi="Times New Roman" w:cs="Times New Roman"/>
-          <w:sz w:val="24"/>
-          <w:szCs w:val="24"/>
-        </w:rPr>
-      </w:pPr>
-      <w:r>
-        <w:rPr>
-          <w:rFonts w:ascii="Times New Roman" w:hAnsi="Times New Roman" w:cs="Times New Roman"/>
-          <w:sz w:val="24"/>
-          <w:szCs w:val="24"/>
-        </w:rPr>
-        <w:t>answering the following questions. Your responses should be clear, concise, and</w:t>
-      </w:r>
-    </w:p>
-    <w:p>
-      <w:pPr>
-        <w:pStyle w:val="ListBullet"/>
-        <w:numPr>
-          <w:ilvl w:val="0"/>
-          <w:numId w:val="0"/>
-        </w:numPr>
-        <w:ind w:left="567" w:hanging="576"/>
-        <w:jc w:val="both"/>
-        <w:rPr>
-          <w:rFonts w:ascii="Times New Roman" w:hAnsi="Times New Roman" w:cs="Times New Roman"/>
-          <w:sz w:val="24"/>
-          <w:szCs w:val="24"/>
-        </w:rPr>
-      </w:pPr>
-      <w:r>
-        <w:rPr>
-          <w:rFonts w:ascii="Times New Roman" w:hAnsi="Times New Roman" w:cs="Times New Roman"/>
-          <w:sz w:val="24"/>
-          <w:szCs w:val="24"/>
-        </w:rPr>
-        <w:t>supported with specific examples from your own work.</w:t>
-      </w:r>
-    </w:p>
-    <w:p>
-      <w:pPr>
-        <w:pStyle w:val="ListBullet"/>
-        <w:numPr>
-          <w:ilvl w:val="0"/>
-          <w:numId w:val="25"/>
-        </w:numPr>
-        <w:jc w:val="both"/>
-        <w:rPr>
-          <w:rFonts w:ascii="Times New Roman" w:hAnsi="Times New Roman" w:cs="Times New Roman"/>
-          <w:sz w:val="24"/>
-          <w:szCs w:val="24"/>
-        </w:rPr>
-      </w:pPr>
-      <w:r>
-        <w:rPr>
-          <w:rFonts w:ascii="Times New Roman" w:hAnsi="Times New Roman" w:cs="Times New Roman"/>
-          <w:sz w:val="24"/>
-          <w:szCs w:val="24"/>
-        </w:rPr>
-        <w:t>Describe one specific challenge or obstacle you encountered during this project and explain in detail how you identified and resolved it.</w:t>
-      </w:r>
-    </w:p>
-    <w:p>
-      <w:pPr>
-        <w:pStyle w:val="ListBullet"/>
-        <w:numPr>
-          <w:ilvl w:val="0"/>
-          <w:numId w:val="25"/>
-        </w:numPr>
-        <w:jc w:val="both"/>
-        <w:rPr>
-          <w:rFonts w:ascii="Times New Roman" w:hAnsi="Times New Roman" w:cs="Times New Roman"/>
-          <w:sz w:val="24"/>
-          <w:szCs w:val="24"/>
-        </w:rPr>
-      </w:pPr>
-      <w:r>
-        <w:rPr>
-          <w:rFonts w:ascii="Times New Roman" w:hAnsi="Times New Roman" w:cs="Times New Roman"/>
-          <w:sz w:val="24"/>
-          <w:szCs w:val="24"/>
-        </w:rPr>
-        <w:t>Explain why you chose your specific approach/method/model over at least one alternative you considered, and what tradeoffs informed that decision.</w:t>
-      </w:r>
-    </w:p>
-    <w:p>
-      <w:pPr>
-        <w:pStyle w:val="ListBullet"/>
-        <w:numPr>
-          <w:ilvl w:val="0"/>
-          <w:numId w:val="25"/>
-        </w:numPr>
-        <w:jc w:val="both"/>
-        <w:rPr>
-          <w:rFonts w:ascii="Times New Roman" w:hAnsi="Times New Roman" w:cs="Times New Roman"/>
-          <w:sz w:val="24"/>
-          <w:szCs w:val="24"/>
-        </w:rPr>
-      </w:pPr>
-      <w:r>
-        <w:rPr>
-          <w:rFonts w:ascii="Times New Roman" w:hAnsi="Times New Roman" w:cs="Times New Roman"/>
-          <w:sz w:val="24"/>
-          <w:szCs w:val="24"/>
-        </w:rPr>
-        <w:t xml:space="preserve">If you used any AI tools during this project (e.g., ChatGPT, Claude, Copilot), disclose which tool(s), for what specific purpose (e.g., debugging, grammar checking, brainstorming), and how you verified or modified the output. </w:t>
-      </w:r>
-    </w:p>
-    <w:p>
-      <w:pPr>
-        <w:pStyle w:val="ListBullet"/>
-        <w:numPr>
-          <w:ilvl w:val="0"/>
-          <w:numId w:val="25"/>
-        </w:numPr>
-        <w:jc w:val="both"/>
-        <w:rPr>
-          <w:rFonts w:ascii="Times New Roman" w:hAnsi="Times New Roman" w:cs="Times New Roman"/>
-          <w:sz w:val="24"/>
-          <w:szCs w:val="24"/>
-        </w:rPr>
-      </w:pPr>
-      <w:r>
-        <w:rPr>
-          <w:rFonts w:ascii="Times New Roman" w:hAnsi="Times New Roman" w:cs="Times New Roman"/>
-          <w:sz w:val="24"/>
-          <w:szCs w:val="24"/>
-        </w:rPr>
-        <w:t>What would you do differently if you were to redo this project with more time or resources?</w:t>
-      </w:r>
-    </w:p>
-    <w:p>
-      <w:pPr>
-        <w:pStyle w:val="ListBullet"/>
-        <w:numPr>
-          <w:ilvl w:val="0"/>
-          <w:numId w:val="0"/>
-        </w:numPr>
-        <w:ind w:left="567" w:hanging="576"/>
-        <w:jc w:val="both"/>
-        <w:rPr>
-          <w:rFonts w:ascii="Times New Roman" w:hAnsi="Times New Roman" w:cs="Times New Roman"/>
-          <w:sz w:val="24"/>
-          <w:szCs w:val="24"/>
-        </w:rPr>
-      </w:pPr>
-    </w:p>
-    <w:p>
-      <w:pPr>
-        <w:pStyle w:val="Heading1"/>
-      </w:pPr>
-      <w:r>
-        <w:lastRenderedPageBreak/>
-        <w:t>Deliverables</w:t>
-      </w:r>
-    </w:p>
-    <w:p>
-      <w:pPr>
-        <w:numPr>
-          <w:ilvl w:val="0"/>
-          <w:numId w:val="22"/>
-        </w:numPr>
-        <w:spacing w:after="200" w:line="276" w:lineRule="auto"/>
-        <w:rPr>
-          <w:rFonts w:ascii="Times New Roman" w:hAnsi="Times New Roman" w:cs="Times New Roman"/>
-          <w:sz w:val="24"/>
-          <w:szCs w:val="24"/>
-        </w:rPr>
-      </w:pPr>
-      <w:r>
-        <w:rPr>
-          <w:rFonts w:ascii="Times New Roman" w:hAnsi="Times New Roman" w:cs="Times New Roman"/>
-          <w:b/>
-          <w:bCs/>
-          <w:sz w:val="24"/>
-          <w:szCs w:val="24"/>
-        </w:rPr>
-        <w:t>Project Report (PDF)</w:t>
-      </w:r>
-      <w:r>
-        <w:rPr>
-          <w:rFonts w:ascii="Times New Roman" w:hAnsi="Times New Roman" w:cs="Times New Roman"/>
-          <w:sz w:val="24"/>
-          <w:szCs w:val="24"/>
-        </w:rPr>
-        <w:t xml:space="preserve"> – System description, ER/EER diagram, relational schema, SQL code, screenshots, and reflection. </w:t>
-      </w:r>
-    </w:p>
-    <w:p>
-      <w:pPr>
-        <w:numPr>
-          <w:ilvl w:val="0"/>
-          <w:numId w:val="22"/>
-        </w:numPr>
-        <w:spacing w:after="200" w:line="276" w:lineRule="auto"/>
-        <w:rPr>
-          <w:rFonts w:ascii="Times New Roman" w:hAnsi="Times New Roman" w:cs="Times New Roman"/>
-          <w:sz w:val="24"/>
-          <w:szCs w:val="24"/>
-        </w:rPr>
-      </w:pPr>
-      <w:r>
-        <w:rPr>
-          <w:rFonts w:ascii="Times New Roman" w:hAnsi="Times New Roman" w:cs="Times New Roman"/>
-          <w:b/>
-          <w:bCs/>
-          <w:sz w:val="24"/>
-          <w:szCs w:val="24"/>
-        </w:rPr>
-        <w:t>SQL Script (.</w:t>
-      </w:r>
-      <w:proofErr w:type="spellStart"/>
-      <w:r>
-        <w:rPr>
-          <w:rFonts w:ascii="Times New Roman" w:hAnsi="Times New Roman" w:cs="Times New Roman"/>
-          <w:b/>
-          <w:bCs/>
-          <w:sz w:val="24"/>
-          <w:szCs w:val="24"/>
-        </w:rPr>
-        <w:t>sql</w:t>
-      </w:r>
-      <w:proofErr w:type="spellEnd"/>
-      <w:r>
-        <w:rPr>
-          <w:rFonts w:ascii="Times New Roman" w:hAnsi="Times New Roman" w:cs="Times New Roman"/>
-          <w:b/>
-          <w:bCs/>
-          <w:sz w:val="24"/>
-          <w:szCs w:val="24"/>
-        </w:rPr>
-        <w:t>)</w:t>
-      </w:r>
-      <w:r>
-        <w:rPr>
-          <w:rFonts w:ascii="Times New Roman" w:hAnsi="Times New Roman" w:cs="Times New Roman"/>
-          <w:sz w:val="24"/>
-          <w:szCs w:val="24"/>
-        </w:rPr>
-        <w:t xml:space="preserve"> – Complete SQL implementation of the project. </w:t>
-      </w:r>
-    </w:p>
-    <w:p>
-      <w:pPr>
-        <w:numPr>
-          <w:ilvl w:val="0"/>
-          <w:numId w:val="22"/>
-        </w:numPr>
-        <w:spacing w:after="200" w:line="276" w:lineRule="auto"/>
-        <w:rPr>
-          <w:rFonts w:ascii="Times New Roman" w:hAnsi="Times New Roman" w:cs="Times New Roman"/>
-          <w:sz w:val="24"/>
-          <w:szCs w:val="24"/>
-        </w:rPr>
-      </w:pPr>
-      <w:r>
-        <w:rPr>
-          <w:rFonts w:ascii="Times New Roman" w:hAnsi="Times New Roman" w:cs="Times New Roman"/>
-          <w:b/>
-          <w:bCs/>
-          <w:sz w:val="24"/>
-          <w:szCs w:val="24"/>
-        </w:rPr>
-        <w:t>GitHub Repository</w:t>
-      </w:r>
-      <w:r>
-        <w:rPr>
-          <w:rFonts w:ascii="Times New Roman" w:hAnsi="Times New Roman" w:cs="Times New Roman"/>
-          <w:sz w:val="24"/>
-          <w:szCs w:val="24"/>
-        </w:rPr>
-        <w:t xml:space="preserve"> – Repository link with the complete project and commit history. </w:t>
-      </w:r>
-    </w:p>
-    <w:p>
-      <w:pPr>
-        <w:numPr>
-          <w:ilvl w:val="0"/>
-          <w:numId w:val="22"/>
-        </w:numPr>
-        <w:spacing w:after="200" w:line="276" w:lineRule="auto"/>
-        <w:rPr>
-          <w:rFonts w:ascii="Times New Roman" w:hAnsi="Times New Roman" w:cs="Times New Roman"/>
-          <w:sz w:val="24"/>
-          <w:szCs w:val="24"/>
-        </w:rPr>
-      </w:pPr>
-      <w:r>
-        <w:rPr>
-          <w:rFonts w:ascii="Times New Roman" w:hAnsi="Times New Roman" w:cs="Times New Roman"/>
-          <w:b/>
-          <w:bCs/>
-          <w:sz w:val="24"/>
-          <w:szCs w:val="24"/>
-        </w:rPr>
-        <w:t>Mid-Project Progress Report</w:t>
-      </w:r>
-      <w:r>
-        <w:rPr>
-          <w:rFonts w:ascii="Times New Roman" w:hAnsi="Times New Roman" w:cs="Times New Roman"/>
-          <w:sz w:val="24"/>
-          <w:szCs w:val="24"/>
-        </w:rPr>
-        <w:t xml:space="preserve"> – Summary of progress, challenges, decisions, and team contributions. </w:t>
-      </w:r>
-    </w:p>
-    <w:p>
-      <w:pPr>
-        <w:numPr>
-          <w:ilvl w:val="0"/>
-          <w:numId w:val="22"/>
-        </w:numPr>
-        <w:spacing w:after="200" w:line="276" w:lineRule="auto"/>
-        <w:rPr>
-          <w:rFonts w:ascii="Times New Roman" w:hAnsi="Times New Roman" w:cs="Times New Roman"/>
-          <w:sz w:val="24"/>
-          <w:szCs w:val="24"/>
-        </w:rPr>
-      </w:pPr>
-      <w:r>
-        <w:rPr>
-          <w:rFonts w:ascii="Times New Roman" w:hAnsi="Times New Roman" w:cs="Times New Roman"/>
-          <w:b/>
-          <w:bCs/>
-          <w:sz w:val="24"/>
-          <w:szCs w:val="24"/>
-        </w:rPr>
-        <w:t>Project Artifacts</w:t>
-      </w:r>
-      <w:r>
-        <w:rPr>
-          <w:rFonts w:ascii="Times New Roman" w:hAnsi="Times New Roman" w:cs="Times New Roman"/>
-          <w:sz w:val="24"/>
-          <w:szCs w:val="24"/>
-        </w:rPr>
-        <w:t xml:space="preserve"> </w:t>
-      </w:r>
-    </w:p>
-    <w:p>
-      <w:pPr>
-        <w:numPr>
-          <w:ilvl w:val="1"/>
-          <w:numId w:val="27"/>
-        </w:numPr>
-        <w:spacing w:after="200" w:line="276" w:lineRule="auto"/>
-        <w:rPr>
-          <w:rFonts w:ascii="Times New Roman" w:hAnsi="Times New Roman" w:cs="Times New Roman"/>
-          <w:sz w:val="24"/>
-          <w:szCs w:val="24"/>
-        </w:rPr>
-      </w:pPr>
-      <w:r>
-        <w:rPr>
-          <w:rFonts w:ascii="Times New Roman" w:hAnsi="Times New Roman" w:cs="Times New Roman"/>
-          <w:sz w:val="24"/>
-          <w:szCs w:val="24"/>
-        </w:rPr>
-        <w:t>Live report document (with edit history): [link]</w:t>
-      </w:r>
-    </w:p>
-    <w:p>
-      <w:pPr>
-        <w:numPr>
-          <w:ilvl w:val="1"/>
-          <w:numId w:val="27"/>
-        </w:numPr>
-        <w:spacing w:after="200" w:line="276" w:lineRule="auto"/>
-        <w:rPr>
-          <w:rFonts w:ascii="Times New Roman" w:hAnsi="Times New Roman" w:cs="Times New Roman"/>
-          <w:sz w:val="24"/>
-          <w:szCs w:val="24"/>
-        </w:rPr>
-      </w:pPr>
-      <w:r>
-        <w:rPr>
-          <w:rFonts w:ascii="Times New Roman" w:hAnsi="Times New Roman" w:cs="Times New Roman"/>
-          <w:sz w:val="24"/>
-          <w:szCs w:val="24"/>
-        </w:rPr>
-        <w:t>GitHub/GitLab repository (with commit history): [link]</w:t>
-      </w:r>
-    </w:p>
-    <w:p>
-      <w:pPr>
-        <w:numPr>
-          <w:ilvl w:val="1"/>
-          <w:numId w:val="27"/>
-        </w:numPr>
-        <w:spacing w:after="200" w:line="276" w:lineRule="auto"/>
-        <w:rPr>
-          <w:rFonts w:ascii="Times New Roman" w:hAnsi="Times New Roman" w:cs="Times New Roman"/>
-          <w:sz w:val="24"/>
-          <w:szCs w:val="24"/>
-        </w:rPr>
-      </w:pPr>
-      <w:r>
-        <w:rPr>
-          <w:rFonts w:ascii="Times New Roman" w:hAnsi="Times New Roman" w:cs="Times New Roman"/>
-          <w:sz w:val="24"/>
-          <w:szCs w:val="24"/>
-        </w:rPr>
-        <w:t xml:space="preserve">Google </w:t>
-      </w:r>
-      <w:proofErr w:type="spellStart"/>
-      <w:r>
-        <w:rPr>
-          <w:rFonts w:ascii="Times New Roman" w:hAnsi="Times New Roman" w:cs="Times New Roman"/>
-          <w:sz w:val="24"/>
-          <w:szCs w:val="24"/>
-        </w:rPr>
-        <w:t>Colab</w:t>
-      </w:r>
-      <w:proofErr w:type="spellEnd"/>
-      <w:r>
-        <w:rPr>
-          <w:rFonts w:ascii="Times New Roman" w:hAnsi="Times New Roman" w:cs="Times New Roman"/>
-          <w:sz w:val="24"/>
-          <w:szCs w:val="24"/>
-        </w:rPr>
-        <w:t xml:space="preserve"> notebook (if applicable): [link]</w:t>
-      </w:r>
-    </w:p>
-    <w:p>
-      <w:pPr>
-        <w:spacing w:after="200" w:line="276" w:lineRule="auto"/>
-        <w:ind w:left="720"/>
-        <w:rPr>
-          <w:rFonts w:ascii="Times New Roman" w:hAnsi="Times New Roman" w:cs="Times New Roman"/>
-          <w:sz w:val="24"/>
-          <w:szCs w:val="24"/>
-        </w:rPr>
-      </w:pPr>
-    </w:p>
-    <w:p>
-      <w:pPr>
-        <w:rPr>
-          <w:rFonts w:ascii="Times New Roman" w:hAnsi="Times New Roman" w:cs="Times New Roman"/>
-          <w:sz w:val="24"/>
-          <w:szCs w:val="24"/>
-        </w:rPr>
-      </w:pPr>
-    </w:p>
-    <w:p>
-      <w:pPr>
-        <w:rPr>
-          <w:rFonts w:ascii="Times New Roman" w:hAnsi="Times New Roman" w:cs="Times New Roman"/>
-          <w:sz w:val="40"/>
-          <w:szCs w:val="40"/>
-        </w:rPr>
-      </w:pPr>
-    </w:p>
-    <w:p>
-      <w:r>
-        <w:br w:type="page"/>
-      </w:r>
-    </w:p>
-    <w:p>
-      <w:pPr>
-        <w:pStyle w:val="Heading1"/>
-      </w:pPr>
-      <w:r>
-        <w:lastRenderedPageBreak/>
-        <w:t>Smart Clinic Database System - Progress Report</w:t>
-      </w:r>
-    </w:p>
-    <w:p>
-      <w:pPr>
-        <w:pStyle w:val="Heading1"/>
-      </w:pPr>
-      <w:r>
-        <w:lastRenderedPageBreak/>
-        <w:t>1. Work Completed During This Period</w:t>
-      </w:r>
-    </w:p>
-    <w:p>
-      <w:r>
-        <w:t>During this stage of the project, our team successfully completed the majority of the required work according to the project specifications.</w:t>
-      </w:r>
-    </w:p>
-    <w:p>
-      <w:pPr>
-        <w:pStyle w:val="Heading2"/>
-      </w:pPr>
-      <w:r>
-        <w:t>A. Database Design (Task 1)</w:t>
-      </w:r>
-    </w:p>
-    <w:p>
-      <w:pPr>
-        <w:pStyle w:val="ListBullet"/>
-      </w:pPr>
-      <w:r>
-        <w:t>Carefully analyzed the project requirements and identified all required entities for the Smart Clinic Database System.</w:t>
-      </w:r>
-    </w:p>
-    <w:p>
-      <w:pPr>
-        <w:pStyle w:val="ListBullet"/>
-      </w:pPr>
-      <w:r>
-        <w:t>Designed a complete Enhanced Entity Relationship (EER) model that accurately represents the clinic's business processes.</w:t>
-      </w:r>
-    </w:p>
-    <w:p>
-      <w:pPr>
-        <w:pStyle w:val="ListBullet"/>
-      </w:pPr>
-      <w:r>
-        <w:t xml:space="preserve">Implemented a specialization/generalization hierarchy where </w:t>
-      </w:r>
-      <w:r>
-        <w:rPr>
-          <w:b/>
-        </w:rPr>
-        <w:t>Employee</w:t>
-      </w:r>
-      <w:r>
-        <w:t xml:space="preserve"> serves as the superclass and </w:t>
-      </w:r>
-      <w:r>
-        <w:rPr>
-          <w:b/>
-        </w:rPr>
-        <w:t>Doctor</w:t>
-      </w:r>
-      <w:r>
-        <w:t xml:space="preserve">, </w:t>
-      </w:r>
-      <w:r>
-        <w:rPr>
-          <w:b/>
-        </w:rPr>
-        <w:t>Nurse</w:t>
-      </w:r>
-      <w:r>
-        <w:t xml:space="preserve">, and </w:t>
-      </w:r>
-      <w:r>
-        <w:rPr>
-          <w:b/>
-        </w:rPr>
-        <w:t>Receptionist</w:t>
-      </w:r>
-      <w:r>
-        <w:t xml:space="preserve"> are subclasses.</w:t>
-      </w:r>
-    </w:p>
-    <w:p>
-      <w:pPr>
-        <w:pStyle w:val="ListBullet"/>
-      </w:pPr>
-      <w:r>
-        <w:t>Defined all entity attributes along with appropriate Primary Keys and Foreign Keys.</w:t>
-      </w:r>
-    </w:p>
-    <w:p>
-      <w:pPr>
-        <w:pStyle w:val="ListBullet"/>
-      </w:pPr>
-      <w:r>
-        <w:t>Established all required relationships and cardinality constraints between entities.</w:t>
-      </w:r>
-    </w:p>
-    <w:p>
-      <w:pPr>
-        <w:pStyle w:val="ListBullet"/>
-      </w:pPr>
-      <w:r>
-        <w:t>Converted the EER model into a normalized relational schema following Third Normal Form (3NF) to reduce redundancy and improve data consistency.</w:t>
-      </w:r>
-    </w:p>
-    <w:p>
-      <w:pPr>
-        <w:pStyle w:val="Heading2"/>
-      </w:pPr>
-      <w:r>
-        <w:t>B. Database Implementation (Task 2)</w:t>
-      </w:r>
-    </w:p>
-    <w:p>
-      <w:r>
-        <w:t>The complete database has been implemented using MySQL.</w:t>
-      </w:r>
-    </w:p>
-    <w:p>
-      <w:r>
-        <w:t>The implementation includes:</w:t>
-      </w:r>
-    </w:p>
-    <w:p>
-      <w:pPr>
-        <w:pStyle w:val="ListBullet"/>
-      </w:pPr>
-      <w:r>
-        <w:t xml:space="preserve">Creation of the </w:t>
-      </w:r>
-      <w:r>
-        <w:rPr>
-          <w:b/>
-        </w:rPr>
-        <w:t>SmartClinic</w:t>
-      </w:r>
-      <w:r>
-        <w:t xml:space="preserve"> database.</w:t>
-      </w:r>
-    </w:p>
-    <w:p>
-      <w:pPr>
-        <w:pStyle w:val="ListBullet"/>
-      </w:pPr>
-      <w:r>
-        <w:t>Creation of all required tables using appropriate SQL statements.</w:t>
-      </w:r>
-    </w:p>
-    <w:p>
-      <w:pPr>
-        <w:pStyle w:val="ListBullet"/>
-      </w:pPr>
-      <w:r>
-        <w:t>Definition of all Primary Keys.</w:t>
-      </w:r>
-    </w:p>
-    <w:p>
-      <w:pPr>
-        <w:pStyle w:val="ListBullet"/>
-      </w:pPr>
-      <w:r>
-        <w:t>Definition of all Foreign Keys.</w:t>
-      </w:r>
-    </w:p>
-    <w:p>
-      <w:pPr>
-        <w:pStyle w:val="ListBullet"/>
-      </w:pPr>
-      <w:r>
-        <w:t>Implementation of NOT NULL constraints.</w:t>
-      </w:r>
-    </w:p>
-    <w:p>
-      <w:pPr>
-        <w:pStyle w:val="ListBullet"/>
-      </w:pPr>
-      <w:r>
-        <w:t>Implementation of UNIQUE constraints.</w:t>
-      </w:r>
-    </w:p>
-    <w:p>
-      <w:pPr>
-        <w:pStyle w:val="ListBullet"/>
-      </w:pPr>
-      <w:r>
-        <w:t>Implementation of CHECK constraints where applicable.</w:t>
-      </w:r>
-    </w:p>
-    <w:p>
-      <w:pPr>
-        <w:pStyle w:val="ListBullet"/>
-      </w:pPr>
-      <w:r>
-        <w:t>Proper use of AUTO_INCREMENT for identifier fields.</w:t>
-      </w:r>
-    </w:p>
-    <w:p>
-      <w:pPr>
-        <w:pStyle w:val="ListBullet"/>
-      </w:pPr>
-      <w:r>
-        <w:t>Verification of referential integrity across all relationships.</w:t>
-      </w:r>
-    </w:p>
-    <w:p>
-      <w:r>
-        <w:t>The implemented database consists of the following tables:</w:t>
-      </w:r>
-    </w:p>
-    <w:p>
-      <w:pPr>
-        <w:pStyle w:val="ListBullet"/>
-      </w:pPr>
-      <w:r>
-        <w:t>Employee</w:t>
-      </w:r>
-    </w:p>
-    <w:p>
-      <w:pPr>
-        <w:pStyle w:val="ListBullet"/>
-      </w:pPr>
-      <w:r>
-        <w:t>Doctor</w:t>
-      </w:r>
-    </w:p>
-    <w:p>
-      <w:pPr>
-        <w:pStyle w:val="ListBullet"/>
-      </w:pPr>
-      <w:r>
-        <w:t>Nurse</w:t>
-      </w:r>
-    </w:p>
-    <w:p>
-      <w:pPr>
-        <w:pStyle w:val="ListBullet"/>
-      </w:pPr>
-      <w:r>
-        <w:t>Receptionist</w:t>
-      </w:r>
-    </w:p>
-    <w:p>
-      <w:pPr>
-        <w:pStyle w:val="ListBullet"/>
-      </w:pPr>
-      <w:r>
-        <w:t>Department</w:t>
-      </w:r>
-    </w:p>
-    <w:p>
-      <w:pPr>
-        <w:pStyle w:val="ListBullet"/>
-      </w:pPr>
-      <w:r>
-        <w:lastRenderedPageBreak/>
-        <w:t>Patient</w:t>
-      </w:r>
-    </w:p>
-    <w:p>
-      <w:pPr>
-        <w:pStyle w:val="ListBullet"/>
-      </w:pPr>
-      <w:r>
-        <w:t>Appointment</w:t>
-      </w:r>
-    </w:p>
-    <w:p>
-      <w:pPr>
-        <w:pStyle w:val="ListBullet"/>
-      </w:pPr>
-      <w:r>
-        <w:t>Treatment</w:t>
-      </w:r>
-    </w:p>
-    <w:p>
-      <w:pPr>
-        <w:pStyle w:val="ListBullet"/>
-      </w:pPr>
-      <w:r>
-        <w:t>Appointment_Treatment</w:t>
-      </w:r>
-    </w:p>
-    <w:p>
-      <w:pPr>
-        <w:pStyle w:val="ListBullet"/>
-      </w:pPr>
-      <w:r>
-        <w:t>Medicine</w:t>
-      </w:r>
-    </w:p>
-    <w:p>
-      <w:pPr>
-        <w:pStyle w:val="ListBullet"/>
-      </w:pPr>
-      <w:r>
-        <w:t>Prescription</w:t>
-      </w:r>
-    </w:p>
-    <w:p>
-      <w:pPr>
-        <w:pStyle w:val="ListBullet"/>
-      </w:pPr>
-      <w:r>
-        <w:t>Prescription_Detail</w:t>
-      </w:r>
-    </w:p>
-    <w:p>
-      <w:pPr>
-        <w:pStyle w:val="ListBullet"/>
-      </w:pPr>
-      <w:r>
-        <w:t>Payment</w:t>
-      </w:r>
-    </w:p>
-    <w:p>
-      <w:r>
-        <w:t>Sample data has been inserted into every main table, with at least five records where required by the project specification.</w:t>
-      </w:r>
-    </w:p>
-    <w:p>
-      <w:pPr>
-        <w:pStyle w:val="Heading2"/>
-      </w:pPr>
-      <w:r>
-        <w:t>C. SQL Operations (Task 3)</w:t>
-      </w:r>
-    </w:p>
-    <w:p>
-      <w:r>
-        <w:t>The required SQL operations have been successfully implemented and tested.</w:t>
-      </w:r>
-    </w:p>
-    <w:p>
-      <w:r>
-        <w:t>Completed operations include:</w:t>
-      </w:r>
-    </w:p>
-    <w:p>
-      <w:pPr>
-        <w:pStyle w:val="ListBullet"/>
-      </w:pPr>
-      <w:r>
-        <w:t>SELECT statements</w:t>
-      </w:r>
-    </w:p>
-    <w:p>
-      <w:pPr>
-        <w:pStyle w:val="ListBullet"/>
-      </w:pPr>
-      <w:r>
-        <w:t>JOIN queries</w:t>
-      </w:r>
-    </w:p>
-    <w:p>
-      <w:pPr>
-        <w:pStyle w:val="ListBullet"/>
-      </w:pPr>
-      <w:r>
-        <w:t>Nested (Subquery) statements</w:t>
-      </w:r>
-    </w:p>
-    <w:p>
-      <w:pPr>
-        <w:pStyle w:val="ListBullet"/>
-      </w:pPr>
-      <w:r>
-        <w:t>Aggregate Functions with GROUP BY</w:t>
-      </w:r>
-    </w:p>
-    <w:p>
-      <w:pPr>
-        <w:pStyle w:val="ListBullet"/>
-      </w:pPr>
-      <w:r>
-        <w:t>UPDATE statements</w:t>
-      </w:r>
-    </w:p>
-    <w:p>
-      <w:pPr>
-        <w:pStyle w:val="ListBullet"/>
-      </w:pPr>
-      <w:r>
-        <w:t>DELETE statements</w:t>
-      </w:r>
-    </w:p>
-    <w:p>
-      <w:pPr>
-        <w:pStyle w:val="ListBullet"/>
-      </w:pPr>
-      <w:r>
-        <w:t>VIEW creation</w:t>
-      </w:r>
-    </w:p>
-    <w:p>
-      <w:pPr>
-        <w:pStyle w:val="ListBullet"/>
-      </w:pPr>
-      <w:r>
-        <w:t>TRIGGER creation</w:t>
-      </w:r>
-    </w:p>
-    <w:p>
-      <w:r>
-        <w:t>All SQL statements were executed successfully in MySQL and produced the expected results.</w:t>
-      </w:r>
-    </w:p>
-    <w:p>
-      <w:pPr>
-        <w:pStyle w:val="Heading1"/>
-      </w:pPr>
-      <w:r>
-        <w:lastRenderedPageBreak/>
-        <w:t>2. Key Design Decision</w:t>
-      </w:r>
-    </w:p>
-    <w:p>
-      <w:r>
-        <w:t>One of the most important design decisions made during this project was implementing a specialization/generalization hierarchy for employees.</w:t>
-      </w:r>
-    </w:p>
-    <w:p>
-      <w:r>
-        <w:t>Initially, the team considered storing all employee information inside a single Employee table. However, this approach would have required numerous nullable columns for role-specific information, resulting in redundant data and reduced normalization.</w:t>
-      </w:r>
-    </w:p>
-    <w:p>
-      <w:r>
-        <w:t xml:space="preserve">Instead, the team designed </w:t>
-      </w:r>
-      <w:r>
-        <w:rPr>
-          <w:b/>
-        </w:rPr>
-        <w:t>Employee</w:t>
-      </w:r>
-      <w:r>
-        <w:t xml:space="preserve"> as the superclass and </w:t>
-      </w:r>
-      <w:r>
-        <w:rPr>
-          <w:b/>
-        </w:rPr>
-        <w:t>Doctor</w:t>
-      </w:r>
-      <w:r>
-        <w:t xml:space="preserve">, </w:t>
-      </w:r>
-      <w:r>
-        <w:rPr>
-          <w:b/>
-        </w:rPr>
-        <w:t>Nurse</w:t>
-      </w:r>
-      <w:r>
-        <w:t xml:space="preserve">, and </w:t>
-      </w:r>
-      <w:r>
-        <w:rPr>
-          <w:b/>
-        </w:rPr>
-        <w:t>Receptionist</w:t>
-      </w:r>
-      <w:r>
-        <w:t xml:space="preserve"> as specialized subclasses.</w:t>
-      </w:r>
-    </w:p>
-    <w:p>
-      <w:r>
-        <w:t>This design provides several advantages:</w:t>
-      </w:r>
-    </w:p>
-    <w:p>
-      <w:pPr>
-        <w:pStyle w:val="ListBullet"/>
-      </w:pPr>
-      <w:r>
-        <w:t>Eliminates redundant data.</w:t>
-      </w:r>
-    </w:p>
-    <w:p>
-      <w:pPr>
-        <w:pStyle w:val="ListBullet"/>
-      </w:pPr>
-      <w:r>
-        <w:t>Improves database normalization.</w:t>
-      </w:r>
-    </w:p>
-    <w:p>
-      <w:pPr>
-        <w:pStyle w:val="ListBullet"/>
-      </w:pPr>
-      <w:r>
-        <w:t>Preserves referential integrity.</w:t>
-      </w:r>
-    </w:p>
-    <w:p>
-      <w:pPr>
-        <w:pStyle w:val="ListBullet"/>
-      </w:pPr>
-      <w:r>
-        <w:t>Makes future expansion easier.</w:t>
-      </w:r>
-    </w:p>
-    <w:p>
-      <w:pPr>
-        <w:pStyle w:val="ListBullet"/>
-      </w:pPr>
-      <w:r>
-        <w:t>Accurately models the real-world organizational structure of the clinic.</w:t>
-      </w:r>
-    </w:p>
-    <w:p>
-      <w:pPr>
-        <w:pStyle w:val="ListBullet"/>
-      </w:pPr>
-      <w:r>
-        <w:t>Fully satisfies the EER specialization/generalization requirement specified in the project instructions.</w:t>
-      </w:r>
-    </w:p>
-    <w:p>
-      <w:r>
-        <w:t>Although this design requires additional JOIN operations when retrieving employee information, the benefits in terms of scalability, maintainability, and data integrity significantly outweigh this minor complexity.</w:t>
-      </w:r>
-    </w:p>
-    <w:p>
-      <w:pPr>
-        <w:pStyle w:val="Heading1"/>
-      </w:pPr>
-      <w:r>
-        <w:lastRenderedPageBreak/>
-        <w:t>3. Challenge Encountered</w:t>
-      </w:r>
-    </w:p>
-    <w:p>
-      <w:r>
-        <w:t xml:space="preserve">One of the main challenges during the project was designing the many-to-many relationship between </w:t>
-      </w:r>
-      <w:r>
-        <w:rPr>
-          <w:b/>
-        </w:rPr>
-        <w:t>Appointment</w:t>
-      </w:r>
-      <w:r>
-        <w:t xml:space="preserve"> and </w:t>
-      </w:r>
-      <w:r>
-        <w:rPr>
-          <w:b/>
-        </w:rPr>
-        <w:t>Treatment</w:t>
-      </w:r>
-      <w:r>
-        <w:t>.</w:t>
-      </w:r>
-    </w:p>
-    <w:p>
-      <w:r>
-        <w:t>Initially, it was unclear how multiple treatments could be assigned to a single appointment while also allowing the same treatment to be associated with multiple appointments.</w:t>
-      </w:r>
-    </w:p>
-    <w:p>
-      <w:r>
-        <w:t xml:space="preserve">After reviewing the database requirements and normalization principles, the team resolved this issue by introducing the </w:t>
-      </w:r>
-      <w:r>
-        <w:rPr>
-          <w:b/>
-        </w:rPr>
-        <w:t>Appointment_Treatment</w:t>
-      </w:r>
-      <w:r>
-        <w:t xml:space="preserve"> junction table.</w:t>
-      </w:r>
-    </w:p>
-    <w:p>
-      <w:r>
-        <w:t>This table uses a composite primary key consisting of:</w:t>
-      </w:r>
-    </w:p>
-    <w:p>
-      <w:pPr>
-        <w:pStyle w:val="ListBullet"/>
-      </w:pPr>
-      <w:r>
-        <w:t>appointment_id</w:t>
-      </w:r>
-    </w:p>
-    <w:p>
-      <w:pPr>
-        <w:pStyle w:val="ListBullet"/>
-      </w:pPr>
-      <w:r>
-        <w:t>treatment_id</w:t>
-      </w:r>
-    </w:p>
-    <w:p>
-      <w:r>
-        <w:t>This solution successfully eliminated data redundancy, preserved referential integrity, and allowed the database to support flexible treatment assignments while maintaining normalization.</w:t>
-      </w:r>
-    </w:p>
-    <w:p>
-      <w:r>
-        <w:t>Another challenge involved ensuring that all foreign key relationships were created in the correct order during database implementation. This was resolved by carefully organizing the table creation sequence and verifying all constraints before inserting sample data.</w:t>
-      </w:r>
-    </w:p>
-    <w:p>
-      <w:pPr>
-        <w:pStyle w:val="Heading1"/>
-      </w:pPr>
-      <w:r>
-        <w:lastRenderedPageBreak/>
-        <w:t>4. Remaining Work</w:t>
-      </w:r>
-    </w:p>
-    <w:p>
-      <w:r>
-        <w:t>At this stage, the database implementation is complete. The remaining tasks focus mainly on documentation and final project preparation.</w:t>
-      </w:r>
-    </w:p>
-    <w:p>
-      <w:r>
-        <w:t>The remaining work includes:</w:t>
-      </w:r>
-    </w:p>
-    <w:p>
-      <w:pPr>
-        <w:pStyle w:val="ListNumber"/>
-      </w:pPr>
-      <w:r>
-        <w:t>Capture screenshots of all populated database tables using MySQL Workbench.</w:t>
-      </w:r>
-    </w:p>
-    <w:p>
-      <w:pPr>
-        <w:pStyle w:val="ListNumber"/>
-      </w:pPr>
-      <w:r>
-        <w:t>Capture screenshots showing the execution and output of every required SQL query.</w:t>
-      </w:r>
-    </w:p>
-    <w:p>
-      <w:pPr>
-        <w:pStyle w:val="ListNumber"/>
-      </w:pPr>
-      <w:r>
-        <w:t>Insert the screenshots into the final project report with appropriate explanations.</w:t>
-      </w:r>
-    </w:p>
-    <w:p>
-      <w:pPr>
-        <w:pStyle w:val="ListNumber"/>
-      </w:pPr>
-      <w:r>
-        <w:t>Complete the Reflection section (300–500 words).</w:t>
-      </w:r>
-    </w:p>
-    <w:p>
-      <w:pPr>
-        <w:pStyle w:val="ListNumber"/>
-      </w:pPr>
-      <w:r>
-        <w:t>Upload the complete SQL script to the GitHub repository.</w:t>
-      </w:r>
-    </w:p>
-    <w:p>
-      <w:pPr>
-        <w:pStyle w:val="ListNumber"/>
-      </w:pPr>
-      <w:r>
-        <w:t>Verify that all project deliverables fully satisfy the assignment requirements.</w:t>
-      </w:r>
-    </w:p>
-    <w:p>
-      <w:pPr>
-        <w:pStyle w:val="ListNumber"/>
-      </w:pPr>
-      <w:r>
-        <w:t>Prepare the final PDF report for submission.</w:t>
-      </w:r>
-    </w:p>
-    <w:p>
-      <w:pPr>
-        <w:pStyle w:val="Heading1"/>
-      </w:pPr>
-      <w:r>
-        <w:lastRenderedPageBreak/>
-        <w:t>5. Group Members and Contributions</w:t>
-      </w:r>
-    </w:p>
-    <w:p>
-      <w:pPr>
-        <w:pStyle w:val="Heading2"/>
-      </w:pPr>
-      <w:r>
-        <w:t xml:space="preserve">Student </w:t>
-      </w:r>
-      <w:proofErr w:type="gramStart"/>
-      <w:r>
-        <w:t xml:space="preserve">Name </w:t>
-      </w:r>
-      <w:r>
-        <w:t>:</w:t>
-      </w:r>
-      <w:proofErr w:type="gramEnd"/>
-      <w:r>
-        <w:rPr>
-          <w:sz w:val="22"/>
-        </w:rPr>
-        <w:t xml:space="preserve"> </w:t>
-      </w:r>
-      <w:proofErr w:type="spellStart"/>
-      <w:r>
-        <w:rPr>
-          <w:sz w:val="22"/>
-        </w:rPr>
-        <w:t>Hanadi</w:t>
-      </w:r>
-      <w:proofErr w:type="spellEnd"/>
-      <w:r>
-        <w:rPr>
-          <w:sz w:val="22"/>
-        </w:rPr>
-        <w:t xml:space="preserve"> Abdullah </w:t>
-      </w:r>
-      <w:proofErr w:type="spellStart"/>
-      <w:r>
-        <w:rPr>
-          <w:sz w:val="22"/>
-        </w:rPr>
-        <w:t>Alshehri</w:t>
-      </w:r>
-      <w:proofErr w:type="spellEnd"/>
-    </w:p>
-    <w:p>
-      <w:pPr>
-        <w:pStyle w:val="ListBullet"/>
-      </w:pPr>
-      <w:r>
-        <w:t>Database requirements analysis.</w:t>
-      </w:r>
-    </w:p>
-    <w:p>
-      <w:pPr>
-        <w:pStyle w:val="ListBullet"/>
-      </w:pPr>
-      <w:r>
-        <w:t>Entity identification.</w:t>
-      </w:r>
-    </w:p>
-    <w:p>
-      <w:pPr>
-        <w:pStyle w:val="ListBullet"/>
-      </w:pPr>
-      <w:r>
-        <w:t>ER/EER diagram design.</w:t>
-      </w:r>
-    </w:p>
-    <w:p>
-      <w:pPr>
-        <w:pStyle w:val="ListBullet"/>
-      </w:pPr>
-      <w:r>
-        <w:t>Relationship and cardinality analysis.</w:t>
-      </w:r>
-    </w:p>
-    <w:p>
-      <w:pPr>
-        <w:pStyle w:val="ListBullet"/>
-      </w:pPr>
-      <w:r>
-        <w:t>Relational schema preparation.</w:t>
-      </w:r>
-    </w:p>
-    <w:p>
-      <w:pPr>
-        <w:pStyle w:val="Heading2"/>
-      </w:pPr>
-      <w:r>
-        <w:t xml:space="preserve">Student </w:t>
-      </w:r>
-      <w:proofErr w:type="gramStart"/>
-      <w:r>
-        <w:t xml:space="preserve">Name </w:t>
-      </w:r>
-      <w:r>
-        <w:t>:</w:t>
-      </w:r>
-      <w:proofErr w:type="gramEnd"/>
-      <w:r>
-        <w:t xml:space="preserve"> </w:t>
-      </w:r>
-      <w:r>
-        <w:rPr>
-          <w:sz w:val="22"/>
-        </w:rPr>
-        <w:t xml:space="preserve">Sakinah Ali </w:t>
-      </w:r>
-      <w:proofErr w:type="spellStart"/>
-      <w:r>
-        <w:rPr>
-          <w:sz w:val="22"/>
-        </w:rPr>
-        <w:t>Almuhaini</w:t>
-      </w:r>
-      <w:proofErr w:type="spellEnd"/>
-    </w:p>
-    <w:p>
-      <w:pPr>
-        <w:pStyle w:val="ListBullet"/>
-      </w:pPr>
-      <w:r>
-        <w:t>Database implementation in MySQL.</w:t>
-      </w:r>
-    </w:p>
-    <w:p>
-      <w:pPr>
-        <w:pStyle w:val="ListBullet"/>
-      </w:pPr>
-      <w:r>
-        <w:t>Table creation.</w:t>
-      </w:r>
-    </w:p>
-    <w:p>
-      <w:pPr>
-        <w:pStyle w:val="ListBullet"/>
-      </w:pPr>
-      <w:r>
-        <w:t>Primary and Foreign Key implementation.</w:t>
-      </w:r>
-    </w:p>
-    <w:p>
-      <w:pPr>
-        <w:pStyle w:val="ListBullet"/>
-      </w:pPr>
-      <w:r>
-        <w:t>Constraint configuration.</w:t>
-      </w:r>
-    </w:p>
-    <w:p>
-      <w:pPr>
-        <w:pStyle w:val="ListBullet"/>
-      </w:pPr>
-      <w:r>
-        <w:t>Data insertion and integrity testing.</w:t>
-      </w:r>
-    </w:p>
-    <w:p>
-      <w:pPr>
-        <w:pStyle w:val="Heading2"/>
-      </w:pPr>
-      <w:r>
-        <w:t xml:space="preserve">Student </w:t>
-      </w:r>
-      <w:proofErr w:type="gramStart"/>
-      <w:r>
-        <w:t xml:space="preserve">Name </w:t>
-      </w:r>
-      <w:r>
-        <w:t>:</w:t>
-      </w:r>
-      <w:proofErr w:type="gramEnd"/>
-      <w:r>
-        <w:t xml:space="preserve"> </w:t>
-      </w:r>
-      <w:r>
-        <w:rPr>
-          <w:sz w:val="22"/>
-        </w:rPr>
-        <w:t xml:space="preserve">Sarah </w:t>
-      </w:r>
-      <w:proofErr w:type="spellStart"/>
-      <w:r>
-        <w:rPr>
-          <w:sz w:val="22"/>
-        </w:rPr>
-        <w:t>hadi</w:t>
-      </w:r>
-      <w:proofErr w:type="spellEnd"/>
-      <w:r>
-        <w:rPr>
-          <w:sz w:val="22"/>
-        </w:rPr>
-        <w:t xml:space="preserve"> </w:t>
-      </w:r>
-      <w:proofErr w:type="spellStart"/>
-      <w:r>
-        <w:rPr>
-          <w:sz w:val="22"/>
-        </w:rPr>
-        <w:t>alyami</w:t>
-      </w:r>
-      <w:proofErr w:type="spellEnd"/>
-    </w:p>
-    <w:p>
-      <w:pPr>
-        <w:pStyle w:val="ListBullet"/>
-      </w:pPr>
-      <w:r>
-        <w:t>Development of SQL queries.</w:t>
-      </w:r>
-    </w:p>
-    <w:p>
-      <w:pPr>
-        <w:pStyle w:val="ListBullet"/>
-      </w:pPr>
-      <w:r>
-        <w:t>Creation of SELECT, JOIN, Nested Queries, Aggregate Queries, UPDATE and DELETE statements.</w:t>
-      </w:r>
-    </w:p>
-    <w:p>
-      <w:pPr>
-        <w:pStyle w:val="ListBullet"/>
-      </w:pPr>
-      <w:r>
-        <w:t>Development and testing of the VIEW.</w:t>
-      </w:r>
-    </w:p>
-    <w:p>
-      <w:pPr>
-        <w:pStyle w:val="ListBullet"/>
-      </w:pPr>
-      <w:r>
-        <w:t>Development and testing of the TRIGGER.</w:t>
-      </w:r>
-    </w:p>
-    <w:p>
-      <w:pPr>
-        <w:pStyle w:val="Heading2"/>
-      </w:pPr>
-      <w:r>
-        <w:t xml:space="preserve">Student </w:t>
-      </w:r>
-      <w:proofErr w:type="gramStart"/>
-      <w:r>
-        <w:t xml:space="preserve">Name </w:t>
-      </w:r>
-      <w:r>
-        <w:t>:</w:t>
-      </w:r>
-      <w:proofErr w:type="gramEnd"/>
-      <w:r>
-        <w:t xml:space="preserve"> </w:t>
-      </w:r>
-      <w:r>
-        <w:rPr>
-          <w:sz w:val="22"/>
-        </w:rPr>
-        <w:t>Kadi Alharbi</w:t>
-      </w:r>
-    </w:p>
-    <w:p>
-      <w:pPr>
-        <w:pStyle w:val="ListBullet"/>
-      </w:pPr>
-      <w:r>
-        <w:t>Project documentation.</w:t>
-      </w:r>
-    </w:p>
-    <w:p>
-      <w:pPr>
-        <w:pStyle w:val="ListBullet"/>
-      </w:pPr>
-      <w:r>
-        <w:t>Report formatting.</w:t>
-      </w:r>
-    </w:p>
-    <w:p>
-      <w:pPr>
-        <w:pStyle w:val="ListBullet"/>
-      </w:pPr>
-      <w:r>
-        <w:t>Screenshot preparation.</w:t>
-      </w:r>
-    </w:p>
-    <w:p>
-      <w:pPr>
-        <w:pStyle w:val="ListBullet"/>
-      </w:pPr>
-      <w:r>
-        <w:t>GitHub repository management.</w:t>
-      </w:r>
-    </w:p>
-    <w:p>
-      <w:pPr>
-        <w:pStyle w:val="ListBullet"/>
-      </w:pPr>
-      <w:r>
-        <w:t>Final project review and quality assurance.</w:t>
-      </w:r>
-    </w:p>
-    <w:p>
-      <w:pPr>
-        <w:pStyle w:val="Heading1"/>
-      </w:pPr>
-      <w:r>
-        <w:lastRenderedPageBreak/>
-        <w:t>Overall Project Status</w:t>
-      </w:r>
-    </w:p>
-    <w:p>
-      <w:r>
-        <w:t>The Smart Clinic Database System has been successfully designed and implemented according to the project requirements. The database structure, SQL implementation, advanced SQL operations, VIEW, and TRIGGER have all been completed and tested successfully. The remaining work primarily involves documentation, screenshots, repository organization, and preparation of the final submission package.</w:t>
       </w:r>
     </w:p>
     <w:sectPr>
@@ -6939,7 +2486,7 @@
             </wp:anchor>
           </w:drawing>
         </mc:Choice>
-        <mc:Fallback xmlns:w16du="http://schemas.microsoft.com/office/word/2023/wordml/word16du" xmlns:w16sdtfl="http://schemas.microsoft.com/office/word/2024/wordml/sdtformatlock">
+        <mc:Fallback xmlns:w16sdtfl="http://schemas.microsoft.com/office/word/2024/wordml/sdtformatlock" xmlns:w16du="http://schemas.microsoft.com/office/word/2023/wordml/word16du">
           <w:pict>
             <v:line w14:anchorId="04400D3D" id="Straight Connector 6" o:spid="_x0000_s1026" style="position:absolute;z-index:251660288;visibility:visible;mso-wrap-style:square;mso-width-percent:0;mso-height-percent:0;mso-wrap-distance-left:9pt;mso-wrap-distance-top:-3e-5mm;mso-wrap-distance-right:9pt;mso-wrap-distance-bottom:-3e-5mm;mso-position-horizontal:absolute;mso-position-horizontal-relative:text;mso-position-vertical:absolute;mso-position-vertical-relative:text;mso-width-percent:0;mso-height-percent:0;mso-width-relative:page;mso-height-relative:page" from="-68.95pt,-666.45pt" to="489.05pt,-666.45pt" o:gfxdata="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" strokecolor="#4f81bd" strokeweight="2pt">
               <v:shadow on="t" opacity="24903f" origin=",.5" offset="0,.55556mm"/>
@@ -7050,7 +2597,7 @@
             <w:rPr>
               <w:noProof/>
             </w:rPr>
-            <w:instrText>Overall Project Status</w:instrText>
+            <w:instrText>Project Instructions</w:instrText>
           </w:r>
           <w:r>
             <w:rPr>
@@ -7083,7 +2630,7 @@
             <w:rPr>
               <w:noProof/>
             </w:rPr>
-            <w:instrText>Overall Project Status</w:instrText>
+            <w:instrText>Project Instructions</w:instrText>
           </w:r>
           <w:r>
             <w:rPr>
@@ -7101,7 +2648,7 @@
             <w:rPr>
               <w:noProof/>
             </w:rPr>
-            <w:t xml:space="preserve">Overall Project Status </w:t>
+            <w:t xml:space="preserve">Project Instructions </w:t>
           </w:r>
           <w:r>
             <w:fldChar w:fldCharType="end"/>
@@ -9959,6 +5506,7 @@
   <w:style w:type="character" w:default="1" w:styleId="DefaultParagraphFont">
     <w:name w:val="Default Paragraph Font"/>
     <w:uiPriority w:val="1"/>
+    <w:semiHidden/>
     <w:unhideWhenUsed/>
   </w:style>
   <w:style w:type="table" w:default="1" w:styleId="TableNormal">
@@ -11136,16 +6684,16 @@
 </file>
 
 <file path=customXml/item2.xml><?xml version="1.0" encoding="utf-8"?>
-<b:Sources xmlns:b="http://schemas.openxmlformats.org/officeDocument/2006/bibliography" SelectedStyle="\APA.XSL" StyleName="APA"/>
-</file>
-
-<file path=customXml/item3.xml><?xml version="1.0" encoding="utf-8"?>
 <?mso-contentType ?>
 <FormTemplates xmlns="http://schemas.microsoft.com/sharepoint/v3/contenttype/forms">
   <Display>DocumentLibraryForm</Display>
   <Edit>AssetEditForm</Edit>
   <New>DocumentLibraryForm</New>
 </FormTemplates>
+</file>
+
+<file path=customXml/item3.xml><?xml version="1.0" encoding="utf-8"?>
+<b:Sources xmlns:b="http://schemas.openxmlformats.org/officeDocument/2006/bibliography" SelectedStyle="\APA.XSL" StyleName="APA"/>
 </file>
 
 <file path=customXml/itemProps1.xml><?xml version="1.0" encoding="utf-8"?>
@@ -11157,17 +6705,17 @@
 </file>
 
 <file path=customXml/itemProps2.xml><?xml version="1.0" encoding="utf-8"?>
+<ds:datastoreItem xmlns:ds="http://schemas.openxmlformats.org/officeDocument/2006/customXml" ds:itemID="{E34C63B7-A026-4A37-9535-4FBB4C03A11D}">
+  <ds:schemaRefs>
+    <ds:schemaRef ds:uri="http://schemas.microsoft.com/sharepoint/v3/contenttype/forms"/>
+  </ds:schemaRefs>
+</ds:datastoreItem>
+</file>
+
+<file path=customXml/itemProps3.xml><?xml version="1.0" encoding="utf-8"?>
 <ds:datastoreItem xmlns:ds="http://schemas.openxmlformats.org/officeDocument/2006/customXml" ds:itemID="{355C5113-D031-41DB-A6D8-43CE1A0E6695}">
   <ds:schemaRefs>
     <ds:schemaRef ds:uri="http://schemas.openxmlformats.org/officeDocument/2006/bibliography"/>
   </ds:schemaRefs>
 </ds:datastoreItem>
-</file>
-
-<file path=customXml/itemProps3.xml><?xml version="1.0" encoding="utf-8"?>
-<ds:datastoreItem xmlns:ds="http://schemas.openxmlformats.org/officeDocument/2006/customXml" ds:itemID="{E34C63B7-A026-4A37-9535-4FBB4C03A11D}">
-  <ds:schemaRefs>
-    <ds:schemaRef ds:uri="http://schemas.microsoft.com/sharepoint/v3/contenttype/forms"/>
-  </ds:schemaRefs>
-</ds:datastoreItem>
 </file>
</xml_diff>